<commit_message>
Proyekt xatoalr tugadi va bitdi
</commit_message>
<xml_diff>
--- a/templates/obyektivka_master.docx
+++ b/templates/obyektivka_master.docx
@@ -426,22 +426,22 @@
           <w:lang w:val="uz-Cyrl-UZ"/>
         </w:rPr>
         <w:t>{{tugilgan_sana}}</w:t>
+      </w:r>
+      <w:r>
+        <w:rPr>
+          <w:sz w:val="22"/>
+          <w:szCs w:val="22"/>
+          <w:lang w:val="uz-Cyrl-UZ"/>
+        </w:rPr>
         <w:tab/>
-        <w:t>{{tugilgan_joy}}</w:t>
-      </w:r>
-      <w:r>
-        <w:rPr>
-          <w:sz w:val="22"/>
-          <w:szCs w:val="22"/>
-          <w:lang w:val="uz-Cyrl-UZ"/>
-        </w:rPr>
-      </w:r>
-      <w:r>
-        <w:rPr>
-          <w:sz w:val="22"/>
-          <w:szCs w:val="22"/>
-          <w:lang w:val="uz-Cyrl-UZ"/>
-        </w:rPr>
+      </w:r>
+      <w:r>
+        <w:rPr>
+          <w:sz w:val="22"/>
+          <w:szCs w:val="22"/>
+          <w:lang w:val="uz-Cyrl-UZ"/>
+        </w:rPr>
+        <w:t xml:space="preserve">{{tugilgan_joy}}</w:t>
       </w:r>
     </w:p>
     <w:p>
@@ -511,22 +511,22 @@
           <w:lang w:val="uz-Cyrl-UZ"/>
         </w:rPr>
         <w:t>{{millati}}</w:t>
+      </w:r>
+      <w:r>
+        <w:rPr>
+          <w:sz w:val="22"/>
+          <w:szCs w:val="22"/>
+          <w:lang w:val="uz-Cyrl-UZ"/>
+        </w:rPr>
         <w:tab/>
+      </w:r>
+      <w:r>
+        <w:rPr>
+          <w:sz w:val="22"/>
+          <w:szCs w:val="22"/>
+          <w:lang w:val="uz-Cyrl-UZ"/>
+        </w:rPr>
         <w:t>{{partiyaviyligi}}</w:t>
-      </w:r>
-      <w:r>
-        <w:rPr>
-          <w:sz w:val="22"/>
-          <w:szCs w:val="22"/>
-          <w:lang w:val="uz-Cyrl-UZ"/>
-        </w:rPr>
-      </w:r>
-      <w:r>
-        <w:rPr>
-          <w:sz w:val="22"/>
-          <w:szCs w:val="22"/>
-          <w:lang w:val="uz-Cyrl-UZ"/>
-        </w:rPr>
       </w:r>
     </w:p>
     <w:p>
@@ -599,35 +599,37 @@
           <w:lang w:val="uz-Cyrl-UZ"/>
         </w:rPr>
         <w:t>{{malumoti}}</w:t>
+      </w:r>
+      <w:r>
+        <w:rPr>
+          <w:sz w:val="22"/>
+          <w:szCs w:val="22"/>
+          <w:lang w:val="uz-Cyrl-UZ"/>
+        </w:rPr>
         <w:tab/>
-        <w:t>{{tamomlagan}}</w:t>
-      </w:r>
-      <w:r>
-        <w:rPr>
-          <w:sz w:val="22"/>
-          <w:szCs w:val="22"/>
-          <w:lang w:val="uz-Cyrl-UZ"/>
-        </w:rPr>
-      </w:r>
-      <w:r>
-        <w:rPr>
-          <w:sz w:val="22"/>
-          <w:szCs w:val="22"/>
-          <w:lang w:val="uz-Cyrl-UZ"/>
-        </w:rPr>
-      </w:r>
-      <w:r>
-        <w:rPr>
-          <w:sz w:val="22"/>
-          <w:szCs w:val="22"/>
-        </w:rPr>
-      </w:r>
-      <w:r>
-        <w:rPr>
-          <w:sz w:val="22"/>
-          <w:szCs w:val="22"/>
-          <w:lang w:val="uz-Cyrl-UZ"/>
-        </w:rPr>
+      </w:r>
+      <w:r>
+        <w:rPr>
+          <w:sz w:val="22"/>
+          <w:szCs w:val="22"/>
+          <w:lang w:val="uz-Cyrl-UZ"/>
+        </w:rPr>
+        <w:t>1982 й</w:t>
+      </w:r>
+      <w:r>
+        <w:rPr>
+          <w:sz w:val="22"/>
+          <w:szCs w:val="22"/>
+        </w:rPr>
+        <w:t>.</w:t>
+      </w:r>
+      <w:r>
+        <w:rPr>
+          <w:sz w:val="22"/>
+          <w:szCs w:val="22"/>
+          <w:lang w:val="uz-Cyrl-UZ"/>
+        </w:rPr>
+        <w:t xml:space="preserve"> Тошкент давлат университети (кундузги)</w:t>
       </w:r>
     </w:p>
     <w:p>
@@ -654,9 +656,67 @@
           <w:szCs w:val="22"/>
           <w:lang/>
         </w:rPr>
-        <w:t>Маълумоти бўйича мутахассислиги:</w:t>
-        <w:tab/>
-        <w:t>{{mutaxassisligi}}</w:t>
+        <w:pict>
+          <v:shape id="_x0000_s1077" o:spid="_x0000_s1077" o:spt="62" type="#_x0000_t62" style="position:absolute;left:0pt;margin-left:349.7pt;margin-top:15.75pt;height:99pt;width:153pt;z-index:251664384;mso-width-relative:page;mso-height-relative:page;" coordsize="21600,21600" adj="-5845,12851">
+            <v:path/>
+            <v:fill focussize="0,0"/>
+            <v:stroke/>
+            <v:imagedata o:title=""/>
+            <o:lock v:ext="edit"/>
+            <o:callout minusx="t" minusy="t"/>
+            <v:textbox>
+              <w:txbxContent>
+                <w:p>
+                  <w:pPr>
+                    <w:pStyle w:val="2"/>
+                    <w:numPr>
+                      <w:ilvl w:val="0"/>
+                      <w:numId w:val="0"/>
+                    </w:numPr>
+                    <w:tabs>
+                      <w:tab w:val="left" w:pos="284"/>
+                    </w:tabs>
+                    <w:jc w:val="center"/>
+                    <w:rPr>
+                      <w:sz w:val="22"/>
+                      <w:lang w:val="uz-Cyrl-UZ"/>
+                    </w:rPr>
+                  </w:pPr>
+                  <w:r>
+                    <w:rPr>
+                      <w:sz w:val="22"/>
+                      <w:lang w:val="uz-Cyrl-UZ"/>
+                    </w:rPr>
+                    <w:t xml:space="preserve">Ҳарбий (махсус) унвони </w:t>
+                  </w:r>
+                  <w:r>
+                    <w:rPr>
+                      <w:b/>
+                      <w:sz w:val="22"/>
+                      <w:u w:val="single"/>
+                      <w:lang w:val="uz-Cyrl-UZ"/>
+                    </w:rPr>
+                    <w:t>фақат</w:t>
+                  </w:r>
+                  <w:r>
+                    <w:rPr>
+                      <w:sz w:val="22"/>
+                      <w:lang w:val="uz-Cyrl-UZ"/>
+                    </w:rPr>
+                    <w:t xml:space="preserve"> ҳарбий ва ҳуқуқни муҳофаза қилиш идоралари ходимлари учун кўрсатилади.</w:t>
+                  </w:r>
+                </w:p>
+                <w:p>
+                  <w:pPr>
+                    <w:rPr>
+                      <w:sz w:val="22"/>
+                    </w:rPr>
+                  </w:pPr>
+                </w:p>
+              </w:txbxContent>
+            </v:textbox>
+          </v:shape>
+        </w:pict>
       </w:r>
       <w:r>
         <w:rPr>
@@ -666,6 +726,7 @@
           <w:szCs w:val="22"/>
           <w:lang w:val="uz-Cyrl-UZ"/>
         </w:rPr>
+        <w:t>Маълумоти бўйича мутахассислиги:</w:t>
       </w:r>
       <w:r>
         <w:rPr>
@@ -675,13 +736,15 @@
           <w:szCs w:val="22"/>
           <w:lang w:val="uz-Cyrl-UZ"/>
         </w:rPr>
-      </w:r>
-      <w:r>
-        <w:rPr>
-          <w:sz w:val="22"/>
-          <w:szCs w:val="22"/>
-          <w:lang w:val="uz-Cyrl-UZ"/>
-        </w:rPr>
+        <w:tab/>
+      </w:r>
+      <w:r>
+        <w:rPr>
+          <w:sz w:val="22"/>
+          <w:szCs w:val="22"/>
+          <w:lang w:val="uz-Cyrl-UZ"/>
+        </w:rPr>
+        <w:t>{{mutaxassisligi}}</w:t>
       </w:r>
     </w:p>
     <w:p>
@@ -809,21 +872,21 @@
           <w:lang w:val="uz-Cyrl-UZ"/>
         </w:rPr>
         <w:t>{{ilmiy_darajasi}}</w:t>
+      </w:r>
+      <w:r>
+        <w:rPr>
+          <w:sz w:val="22"/>
+          <w:szCs w:val="22"/>
+          <w:lang w:val="uz-Cyrl-UZ"/>
+        </w:rPr>
         <w:tab/>
+      </w:r>
+      <w:r>
+        <w:rPr>
+          <w:sz w:val="22"/>
+          <w:szCs w:val="22"/>
+        </w:rPr>
         <w:t>{{ilmiy_unvoni}}</w:t>
-      </w:r>
-      <w:r>
-        <w:rPr>
-          <w:sz w:val="22"/>
-          <w:szCs w:val="22"/>
-          <w:lang w:val="uz-Cyrl-UZ"/>
-        </w:rPr>
-      </w:r>
-      <w:r>
-        <w:rPr>
-          <w:sz w:val="22"/>
-          <w:szCs w:val="22"/>
-        </w:rPr>
       </w:r>
     </w:p>
     <w:p>
@@ -895,23 +958,23 @@
           <w:szCs w:val="22"/>
           <w:lang w:val="uz-Cyrl-UZ"/>
         </w:rPr>
-        <w:t>{{chet_tillari}}</w:t>
+        <w:t xml:space="preserve">{{chet_tillari}}</w:t>
+      </w:r>
+      <w:r>
+        <w:rPr>
+          <w:sz w:val="22"/>
+          <w:szCs w:val="22"/>
+          <w:lang w:val="uz-Cyrl-UZ"/>
+        </w:rPr>
         <w:tab/>
+      </w:r>
+      <w:r>
+        <w:rPr>
+          <w:sz w:val="22"/>
+          <w:szCs w:val="22"/>
+          <w:lang w:val="uz-Cyrl-UZ"/>
+        </w:rPr>
         <w:t>{{harbiy_unvoni}}</w:t>
-      </w:r>
-      <w:r>
-        <w:rPr>
-          <w:sz w:val="22"/>
-          <w:szCs w:val="22"/>
-          <w:lang w:val="uz-Cyrl-UZ"/>
-        </w:rPr>
-      </w:r>
-      <w:r>
-        <w:rPr>
-          <w:sz w:val="22"/>
-          <w:szCs w:val="22"/>
-          <w:lang w:val="uz-Cyrl-UZ"/>
-        </w:rPr>
       </w:r>
     </w:p>
     <w:p>
@@ -979,14 +1042,15 @@
           <w:szCs w:val="22"/>
           <w:lang/>
         </w:rPr>
-        <w:t>{{mukofotlari}}</w:t>
-      </w:r>
-      <w:r>
-        <w:rPr>
-          <w:sz w:val="22"/>
-          <w:szCs w:val="22"/>
-          <w:lang w:val="uz-Cyrl-UZ"/>
-        </w:rPr>
+        <w:t xml:space="preserve">2005 </w:t>
+      </w:r>
+      <w:r>
+        <w:rPr>
+          <w:sz w:val="22"/>
+          <w:szCs w:val="22"/>
+          <w:lang w:val="uz-Cyrl-UZ"/>
+        </w:rPr>
+        <w:t>й. “Шуҳрати” медал, 2010 й. “Меҳнат шуҳрати” ордени</w:t>
       </w:r>
     </w:p>
     <w:p>
@@ -1149,7 +1213,7 @@
           <w:szCs w:val="22"/>
           <w:lang w:val="uz-Cyrl-UZ"/>
         </w:rPr>
-        <w:t>{{deputatligi}}</w:t>
+        <w:t xml:space="preserve">{{deputatligi}}</w:t>
       </w:r>
     </w:p>
     <w:p>
@@ -1556,7 +1620,36 @@
           <w:szCs w:val="22"/>
           <w:lang/>
         </w:rPr>
-        <w:t>{{fish}}нинг яқин қариндошлари ҳақида</w:t>
+        <w:pict>
+          <v:shape id="_x0000_s1088" o:spid="_x0000_s1088" o:spt="62" type="#_x0000_t62" style="position:absolute;left:0pt;margin-left:18.45pt;margin-top:5.25pt;height:22.55pt;width:77.1pt;z-index:251668480;mso-width-relative:page;mso-height-relative:page;" coordsize="21600,21600" adj="20045,-47798">
+            <v:path/>
+            <v:fill focussize="0,0"/>
+            <v:stroke/>
+            <v:imagedata o:title=""/>
+            <o:lock v:ext="edit"/>
+            <o:callout minusx="t" minusy="t"/>
+            <v:textbox>
+              <w:txbxContent>
+                <w:p>
+                  <w:pPr>
+                    <w:rPr>
+                      <w:lang w:val="uz-Cyrl-UZ"/>
+                    </w:rPr>
+                  </w:pPr>
+                  <w:r>
+                    <w:t>Шрифт 1</w:t>
+                  </w:r>
+                  <w:r>
+                    <w:rPr>
+                      <w:lang w:val="uz-Cyrl-UZ"/>
+                    </w:rPr>
+                    <w:t>1</w:t>
+                  </w:r>
+                </w:p>
+              </w:txbxContent>
+            </v:textbox>
+          </v:shape>
+        </w:pict>
       </w:r>
       <w:r>
         <w:rPr>
@@ -1565,6 +1658,7 @@
           <w:szCs w:val="22"/>
           <w:lang w:val="uz-Cyrl-UZ"/>
         </w:rPr>
+        <w:br w:type="page"/>
       </w:r>
       <w:r>
         <w:rPr>
@@ -1572,6 +1666,44 @@
           <w:bCs/>
           <w:lang/>
         </w:rPr>
+        <w:pict>
+          <v:shape id="_x0000_s1090" o:spid="_x0000_s1090" o:spt="62" type="#_x0000_t62" style="position:absolute;left:0pt;margin-left:-40.3pt;margin-top:-13.5pt;height:20.1pt;width:67.9pt;z-index:251670528;mso-width-relative:page;mso-height-relative:page;" coordsize="21600,21600" adj="27247,51475">
+            <v:path/>
+            <v:fill focussize="0,0"/>
+            <v:stroke/>
+            <v:imagedata o:title=""/>
+            <o:lock v:ext="edit"/>
+            <o:callout minusx="t" minusy="t"/>
+            <v:textbox>
+              <w:txbxContent>
+                <w:p>
+                  <w:pPr>
+                    <w:rPr>
+                      <w:sz w:val="22"/>
+                      <w:szCs w:val="22"/>
+                      <w:lang w:val="uz-Cyrl-UZ"/>
+                    </w:rPr>
+                  </w:pPr>
+                  <w:r>
+                    <w:rPr>
+                      <w:sz w:val="22"/>
+                      <w:szCs w:val="22"/>
+                    </w:rPr>
+                    <w:t>Шрифт 1</w:t>
+                  </w:r>
+                  <w:r>
+                    <w:rPr>
+                      <w:sz w:val="22"/>
+                      <w:szCs w:val="22"/>
+                      <w:lang w:val="uz-Cyrl-UZ"/>
+                    </w:rPr>
+                    <w:t>1</w:t>
+                  </w:r>
+                </w:p>
+              </w:txbxContent>
+            </v:textbox>
+          </v:shape>
+        </w:pict>
       </w:r>
       <w:r>
         <w:rPr>
@@ -1579,6 +1711,7 @@
           <w:sz w:val="24"/>
           <w:lang w:val="uz-Cyrl-UZ"/>
         </w:rPr>
+        <w:t>{{fish}}нинг яқин қариндошлари ҳақида</w:t>
       </w:r>
     </w:p>
     <w:p>
@@ -1963,6 +2096,11 @@
               </w:rPr>
             </w:pPr>
             <w:r>
+              <w:rPr>
+                <w:sz w:val="22"/>
+                <w:szCs w:val="22"/>
+                <w:lang w:val="uz-Cyrl-UZ"/>
+              </w:rPr>
               <w:t>{{ota}}</w:t>
             </w:r>
           </w:p>
@@ -1983,6 +2121,11 @@
               </w:rPr>
             </w:pPr>
             <w:r>
+              <w:rPr>
+                <w:sz w:val="22"/>
+                <w:szCs w:val="22"/>
+                <w:lang w:val="uz-Cyrl-UZ"/>
+              </w:rPr>
               <w:t>{{ota_yil}}</w:t>
             </w:r>
           </w:p>
@@ -2003,6 +2146,11 @@
               </w:rPr>
             </w:pPr>
             <w:r>
+              <w:rPr>
+                <w:sz w:val="22"/>
+                <w:szCs w:val="22"/>
+                <w:lang w:val="uz-Cyrl-UZ"/>
+              </w:rPr>
               <w:t>{{ota_ish}}</w:t>
             </w:r>
           </w:p>
@@ -2023,6 +2171,11 @@
               </w:rPr>
             </w:pPr>
             <w:r>
+              <w:rPr>
+                <w:sz w:val="22"/>
+                <w:szCs w:val="22"/>
+                <w:lang w:val="uz-Cyrl-UZ"/>
+              </w:rPr>
               <w:t>{{ota_tur}}</w:t>
             </w:r>
           </w:p>
@@ -2093,6 +2246,11 @@
               </w:rPr>
             </w:pPr>
             <w:r>
+              <w:rPr>
+                <w:sz w:val="22"/>
+                <w:szCs w:val="22"/>
+                <w:lang w:val="uz-Cyrl-UZ"/>
+              </w:rPr>
               <w:t>{{ona}}</w:t>
             </w:r>
           </w:p>
@@ -2113,6 +2271,11 @@
               </w:rPr>
             </w:pPr>
             <w:r>
+              <w:rPr>
+                <w:sz w:val="22"/>
+                <w:szCs w:val="22"/>
+                <w:lang w:val="uz-Cyrl-UZ"/>
+              </w:rPr>
               <w:t>{{ona_yil}}</w:t>
             </w:r>
           </w:p>
@@ -2134,7 +2297,12 @@
               </w:rPr>
             </w:pPr>
             <w:r>
-              <w:t>{{ona_tur}}</w:t>
+              <w:rPr>
+                <w:sz w:val="22"/>
+                <w:szCs w:val="22"/>
+                <w:lang w:val="uz-Cyrl-UZ"/>
+              </w:rPr>
+              <w:t>{{ona_ish}}</w:t>
             </w:r>
           </w:p>
         </w:tc>
@@ -2204,6 +2372,11 @@
               </w:rPr>
             </w:pPr>
             <w:r>
+              <w:rPr>
+                <w:sz w:val="22"/>
+                <w:szCs w:val="22"/>
+                <w:lang w:val="uz-Cyrl-UZ"/>
+              </w:rPr>
               <w:t>{{opa}}</w:t>
             </w:r>
           </w:p>
@@ -2224,6 +2397,11 @@
               </w:rPr>
             </w:pPr>
             <w:r>
+              <w:rPr>
+                <w:sz w:val="22"/>
+                <w:szCs w:val="22"/>
+                <w:lang w:val="uz-Cyrl-UZ"/>
+              </w:rPr>
               <w:t>{{opa_yil}}</w:t>
             </w:r>
           </w:p>
@@ -2244,6 +2422,11 @@
               </w:rPr>
             </w:pPr>
             <w:r>
+              <w:rPr>
+                <w:sz w:val="22"/>
+                <w:szCs w:val="22"/>
+                <w:lang w:val="uz-Cyrl-UZ"/>
+              </w:rPr>
               <w:t>{{opa_ish}}</w:t>
             </w:r>
           </w:p>
@@ -2264,6 +2447,11 @@
               </w:rPr>
             </w:pPr>
             <w:r>
+              <w:rPr>
+                <w:sz w:val="22"/>
+                <w:szCs w:val="22"/>
+                <w:lang w:val="uz-Cyrl-UZ"/>
+              </w:rPr>
               <w:t>{{opa_tur}}</w:t>
             </w:r>
           </w:p>
@@ -2334,6 +2522,11 @@
               </w:rPr>
             </w:pPr>
             <w:r>
+              <w:rPr>
+                <w:sz w:val="22"/>
+                <w:szCs w:val="22"/>
+                <w:lang w:val="uz-Cyrl-UZ"/>
+              </w:rPr>
               <w:t>{{singil}}</w:t>
             </w:r>
           </w:p>
@@ -2354,6 +2547,11 @@
               </w:rPr>
             </w:pPr>
             <w:r>
+              <w:rPr>
+                <w:sz w:val="22"/>
+                <w:szCs w:val="22"/>
+                <w:lang w:val="uz-Cyrl-UZ"/>
+              </w:rPr>
               <w:t>{{singil_yil}}</w:t>
             </w:r>
           </w:p>
@@ -2374,6 +2572,11 @@
               </w:rPr>
             </w:pPr>
             <w:r>
+              <w:rPr>
+                <w:sz w:val="22"/>
+                <w:szCs w:val="22"/>
+                <w:lang w:val="uz-Cyrl-UZ"/>
+              </w:rPr>
               <w:t>{{singil_ish}}</w:t>
             </w:r>
           </w:p>
@@ -2394,6 +2597,11 @@
               </w:rPr>
             </w:pPr>
             <w:r>
+              <w:rPr>
+                <w:sz w:val="22"/>
+                <w:szCs w:val="22"/>
+                <w:lang w:val="uz-Cyrl-UZ"/>
+              </w:rPr>
               <w:t>{{singil_tur}}</w:t>
             </w:r>
           </w:p>
@@ -2464,6 +2672,11 @@
               </w:rPr>
             </w:pPr>
             <w:r>
+              <w:rPr>
+                <w:sz w:val="22"/>
+                <w:szCs w:val="22"/>
+                <w:lang w:val="uz-Cyrl-UZ"/>
+              </w:rPr>
               <w:t>{{uka}}</w:t>
             </w:r>
           </w:p>
@@ -2484,6 +2697,11 @@
               </w:rPr>
             </w:pPr>
             <w:r>
+              <w:rPr>
+                <w:sz w:val="22"/>
+                <w:szCs w:val="22"/>
+                <w:lang w:val="uz-Cyrl-UZ"/>
+              </w:rPr>
               <w:t>{{uka_yil}}</w:t>
             </w:r>
           </w:p>
@@ -2504,6 +2722,11 @@
               </w:rPr>
             </w:pPr>
             <w:r>
+              <w:rPr>
+                <w:sz w:val="22"/>
+                <w:szCs w:val="22"/>
+                <w:lang w:val="uz-Cyrl-UZ"/>
+              </w:rPr>
               <w:t>{{uka_ish}}</w:t>
             </w:r>
           </w:p>
@@ -2524,6 +2747,11 @@
               </w:rPr>
             </w:pPr>
             <w:r>
+              <w:rPr>
+                <w:sz w:val="22"/>
+                <w:szCs w:val="22"/>
+                <w:lang w:val="uz-Cyrl-UZ"/>
+              </w:rPr>
               <w:t>{{uka_tur}}</w:t>
             </w:r>
           </w:p>
@@ -2594,6 +2822,11 @@
               </w:rPr>
             </w:pPr>
             <w:r>
+              <w:rPr>
+                <w:sz w:val="22"/>
+                <w:szCs w:val="22"/>
+                <w:lang w:val="uz-Cyrl-UZ"/>
+              </w:rPr>
               <w:t>{{aka}}</w:t>
             </w:r>
           </w:p>
@@ -2614,6 +2847,11 @@
               </w:rPr>
             </w:pPr>
             <w:r>
+              <w:rPr>
+                <w:sz w:val="22"/>
+                <w:szCs w:val="22"/>
+                <w:lang w:val="uz-Cyrl-UZ"/>
+              </w:rPr>
               <w:t>{{aka_yil}}</w:t>
             </w:r>
           </w:p>
@@ -2634,6 +2872,11 @@
               </w:rPr>
             </w:pPr>
             <w:r>
+              <w:rPr>
+                <w:sz w:val="22"/>
+                <w:szCs w:val="22"/>
+                <w:lang w:val="uz-Cyrl-UZ"/>
+              </w:rPr>
               <w:t>{{aka_ish}}</w:t>
             </w:r>
           </w:p>
@@ -2654,6 +2897,11 @@
               </w:rPr>
             </w:pPr>
             <w:r>
+              <w:rPr>
+                <w:sz w:val="22"/>
+                <w:szCs w:val="22"/>
+                <w:lang w:val="uz-Cyrl-UZ"/>
+              </w:rPr>
               <w:t>{{aka_tur}}</w:t>
             </w:r>
           </w:p>
@@ -2724,6 +2972,11 @@
               </w:rPr>
             </w:pPr>
             <w:r>
+              <w:rPr>
+                <w:sz w:val="22"/>
+                <w:szCs w:val="22"/>
+                <w:lang w:val="uz-Cyrl-UZ"/>
+              </w:rPr>
               <w:t>{{turmush_ortogi}}</w:t>
             </w:r>
           </w:p>
@@ -2744,6 +2997,11 @@
               </w:rPr>
             </w:pPr>
             <w:r>
+              <w:rPr>
+                <w:sz w:val="22"/>
+                <w:szCs w:val="22"/>
+                <w:lang w:val="uz-Cyrl-UZ"/>
+              </w:rPr>
               <w:t>{{turmush_ortogi_yil}}</w:t>
             </w:r>
           </w:p>
@@ -2764,6 +3022,11 @@
               </w:rPr>
             </w:pPr>
             <w:r>
+              <w:rPr>
+                <w:sz w:val="22"/>
+                <w:szCs w:val="22"/>
+                <w:lang w:val="uz-Cyrl-UZ"/>
+              </w:rPr>
               <w:t>{{turmush_ortogi_ish}}</w:t>
             </w:r>
           </w:p>
@@ -2784,6 +3047,11 @@
               </w:rPr>
             </w:pPr>
             <w:r>
+              <w:rPr>
+                <w:sz w:val="22"/>
+                <w:szCs w:val="22"/>
+                <w:lang w:val="uz-Cyrl-UZ"/>
+              </w:rPr>
               <w:t>{{turmush_ortogi_tur}}</w:t>
             </w:r>
           </w:p>
@@ -2854,6 +3122,11 @@
               </w:rPr>
             </w:pPr>
             <w:r>
+              <w:rPr>
+                <w:sz w:val="22"/>
+                <w:szCs w:val="22"/>
+                <w:lang w:val="uz-Cyrl-UZ"/>
+              </w:rPr>
               <w:t>{{farzandlar}}</w:t>
             </w:r>
           </w:p>
@@ -2874,6 +3147,11 @@
               </w:rPr>
             </w:pPr>
             <w:r>
+              <w:rPr>
+                <w:sz w:val="22"/>
+                <w:szCs w:val="22"/>
+                <w:lang w:val="uz-Cyrl-UZ"/>
+              </w:rPr>
               <w:t>{{farzandlar_yil}}</w:t>
             </w:r>
           </w:p>
@@ -2894,6 +3172,11 @@
               </w:rPr>
             </w:pPr>
             <w:r>
+              <w:rPr>
+                <w:sz w:val="22"/>
+                <w:szCs w:val="22"/>
+                <w:lang w:val="uz-Cyrl-UZ"/>
+              </w:rPr>
               <w:t>{{farzandlar_ish}}</w:t>
             </w:r>
           </w:p>
@@ -2914,6 +3197,11 @@
               </w:rPr>
             </w:pPr>
             <w:r>
+              <w:rPr>
+                <w:sz w:val="22"/>
+                <w:szCs w:val="22"/>
+                <w:lang w:val="uz-Cyrl-UZ"/>
+              </w:rPr>
               <w:t>{{farzandlar_tur}}</w:t>
             </w:r>
           </w:p>
@@ -2984,6 +3272,11 @@
               </w:rPr>
             </w:pPr>
             <w:r>
+              <w:rPr>
+                <w:sz w:val="22"/>
+                <w:szCs w:val="22"/>
+                <w:lang w:val="uz-Cyrl-UZ"/>
+              </w:rPr>
               <w:t>{{farzandlar_2}}</w:t>
             </w:r>
           </w:p>
@@ -3004,6 +3297,11 @@
               </w:rPr>
             </w:pPr>
             <w:r>
+              <w:rPr>
+                <w:sz w:val="22"/>
+                <w:szCs w:val="22"/>
+                <w:lang w:val="uz-Cyrl-UZ"/>
+              </w:rPr>
               <w:t>{{farzandlar_2_yil}}</w:t>
             </w:r>
           </w:p>
@@ -3024,6 +3322,11 @@
               </w:rPr>
             </w:pPr>
             <w:r>
+              <w:rPr>
+                <w:sz w:val="22"/>
+                <w:szCs w:val="22"/>
+                <w:lang w:val="uz-Cyrl-UZ"/>
+              </w:rPr>
               <w:t>{{farzandlar_2_ish}}</w:t>
             </w:r>
           </w:p>
@@ -3044,6 +3347,11 @@
               </w:rPr>
             </w:pPr>
             <w:r>
+              <w:rPr>
+                <w:sz w:val="22"/>
+                <w:szCs w:val="22"/>
+                <w:lang w:val="uz-Cyrl-UZ"/>
+              </w:rPr>
               <w:t>{{farzandlar_2_tur}}</w:t>
             </w:r>
           </w:p>
@@ -3115,6 +3423,11 @@
               </w:rPr>
             </w:pPr>
             <w:r>
+              <w:rPr>
+                <w:sz w:val="22"/>
+                <w:szCs w:val="22"/>
+                <w:lang w:val="uz-Cyrl-UZ"/>
+              </w:rPr>
               <w:t>{{farzandlar_3}}</w:t>
             </w:r>
           </w:p>
@@ -3135,6 +3448,11 @@
               </w:rPr>
             </w:pPr>
             <w:r>
+              <w:rPr>
+                <w:sz w:val="22"/>
+                <w:szCs w:val="22"/>
+                <w:lang w:val="uz-Cyrl-UZ"/>
+              </w:rPr>
               <w:t>{{farzandlar_3_yil}}</w:t>
             </w:r>
           </w:p>
@@ -3155,6 +3473,11 @@
               </w:rPr>
             </w:pPr>
             <w:r>
+              <w:rPr>
+                <w:sz w:val="22"/>
+                <w:szCs w:val="22"/>
+                <w:lang w:val="uz-Cyrl-UZ"/>
+              </w:rPr>
               <w:t>{{farzandlar_3_ish}}</w:t>
             </w:r>
           </w:p>
@@ -3175,6 +3498,11 @@
               </w:rPr>
             </w:pPr>
             <w:r>
+              <w:rPr>
+                <w:sz w:val="22"/>
+                <w:szCs w:val="22"/>
+                <w:lang w:val="uz-Cyrl-UZ"/>
+              </w:rPr>
               <w:t>{{farzandlar_3_tur}}</w:t>
             </w:r>
           </w:p>
@@ -3245,6 +3573,11 @@
               </w:rPr>
             </w:pPr>
             <w:r>
+              <w:rPr>
+                <w:sz w:val="22"/>
+                <w:szCs w:val="22"/>
+                <w:lang w:val="uz-Cyrl-UZ"/>
+              </w:rPr>
               <w:t>{{farzandlar_4}}</w:t>
             </w:r>
           </w:p>
@@ -3265,6 +3598,11 @@
               </w:rPr>
             </w:pPr>
             <w:r>
+              <w:rPr>
+                <w:sz w:val="22"/>
+                <w:szCs w:val="22"/>
+                <w:lang w:val="uz-Cyrl-UZ"/>
+              </w:rPr>
               <w:t>{{farzandlar_4_yil}}</w:t>
             </w:r>
           </w:p>
@@ -3285,6 +3623,11 @@
               </w:rPr>
             </w:pPr>
             <w:r>
+              <w:rPr>
+                <w:sz w:val="22"/>
+                <w:szCs w:val="22"/>
+                <w:lang w:val="uz-Cyrl-UZ"/>
+              </w:rPr>
               <w:t>{{farzandlar_4_ish}}</w:t>
             </w:r>
           </w:p>
@@ -3305,6 +3648,11 @@
               </w:rPr>
             </w:pPr>
             <w:r>
+              <w:rPr>
+                <w:sz w:val="22"/>
+                <w:szCs w:val="22"/>
+                <w:lang w:val="uz-Cyrl-UZ"/>
+              </w:rPr>
               <w:t>{{farzandlar_4_tur}}</w:t>
             </w:r>
           </w:p>
@@ -3375,6 +3723,11 @@
               </w:rPr>
             </w:pPr>
             <w:r>
+              <w:rPr>
+                <w:sz w:val="22"/>
+                <w:szCs w:val="22"/>
+                <w:lang w:val="uz-Cyrl-UZ"/>
+              </w:rPr>
               <w:t>{{farzandlar_5}}</w:t>
             </w:r>
           </w:p>
@@ -3395,6 +3748,11 @@
               </w:rPr>
             </w:pPr>
             <w:r>
+              <w:rPr>
+                <w:sz w:val="22"/>
+                <w:szCs w:val="22"/>
+                <w:lang w:val="uz-Cyrl-UZ"/>
+              </w:rPr>
               <w:t>{{farzandlar_5_yil}}</w:t>
             </w:r>
           </w:p>
@@ -3415,6 +3773,11 @@
               </w:rPr>
             </w:pPr>
             <w:r>
+              <w:rPr>
+                <w:sz w:val="22"/>
+                <w:szCs w:val="22"/>
+                <w:lang w:val="uz-Cyrl-UZ"/>
+              </w:rPr>
               <w:t>{{farzandlar_5_ish}}</w:t>
             </w:r>
           </w:p>
@@ -3435,6 +3798,11 @@
               </w:rPr>
             </w:pPr>
             <w:r>
+              <w:rPr>
+                <w:sz w:val="22"/>
+                <w:szCs w:val="22"/>
+                <w:lang w:val="uz-Cyrl-UZ"/>
+              </w:rPr>
               <w:t>{{farzandlar_5_tur}}</w:t>
             </w:r>
           </w:p>
@@ -3506,6 +3874,11 @@
               </w:rPr>
             </w:pPr>
             <w:r>
+              <w:rPr>
+                <w:sz w:val="22"/>
+                <w:szCs w:val="22"/>
+                <w:lang w:val="uz-Cyrl-UZ"/>
+              </w:rPr>
               <w:t>{{farzandlar_6}}</w:t>
             </w:r>
           </w:p>
@@ -3526,6 +3899,11 @@
               </w:rPr>
             </w:pPr>
             <w:r>
+              <w:rPr>
+                <w:sz w:val="22"/>
+                <w:szCs w:val="22"/>
+                <w:lang w:val="uz-Cyrl-UZ"/>
+              </w:rPr>
               <w:t>{{farzandlar_6_yil}}</w:t>
             </w:r>
           </w:p>
@@ -3546,6 +3924,11 @@
               </w:rPr>
             </w:pPr>
             <w:r>
+              <w:rPr>
+                <w:sz w:val="22"/>
+                <w:szCs w:val="22"/>
+                <w:lang w:val="uz-Cyrl-UZ"/>
+              </w:rPr>
               <w:t>{{farzandlar_6_ish}}</w:t>
             </w:r>
           </w:p>
@@ -3566,6 +3949,11 @@
               </w:rPr>
             </w:pPr>
             <w:r>
+              <w:rPr>
+                <w:sz w:val="22"/>
+                <w:szCs w:val="22"/>
+                <w:lang w:val="uz-Cyrl-UZ"/>
+              </w:rPr>
               <w:t>{{farzandlar_6_tur}}</w:t>
             </w:r>
           </w:p>
@@ -3636,6 +4024,11 @@
               </w:rPr>
             </w:pPr>
             <w:r>
+              <w:rPr>
+                <w:sz w:val="22"/>
+                <w:szCs w:val="22"/>
+                <w:lang w:val="uz-Cyrl-UZ"/>
+              </w:rPr>
               <w:t>{{qaynota}}</w:t>
             </w:r>
           </w:p>
@@ -3656,6 +4049,11 @@
               </w:rPr>
             </w:pPr>
             <w:r>
+              <w:rPr>
+                <w:sz w:val="22"/>
+                <w:szCs w:val="22"/>
+                <w:lang w:val="uz-Cyrl-UZ"/>
+              </w:rPr>
               <w:t>{{qaynota_yil}}</w:t>
             </w:r>
           </w:p>
@@ -3677,18 +4075,13 @@
               </w:rPr>
             </w:pPr>
             <w:r>
-              <w:t>{{qaynota_tur}}</w:t>
-            </w:r>
-          </w:p>
-          <w:p>
-            <w:pPr>
-              <w:jc w:val="center"/>
-              <w:rPr>
-                <w:sz w:val="22"/>
-                <w:szCs w:val="22"/>
-                <w:lang w:val="uz-Cyrl-UZ"/>
-              </w:rPr>
-            </w:pPr>
+              <w:rPr>
+                <w:sz w:val="22"/>
+                <w:szCs w:val="22"/>
+                <w:lang w:val="uz-Cyrl-UZ"/>
+              </w:rPr>
+              <w:t>{{qaynota_ish}}</w:t>
+            </w:r>
           </w:p>
         </w:tc>
       </w:tr>
@@ -3757,6 +4150,11 @@
               </w:rPr>
             </w:pPr>
             <w:r>
+              <w:rPr>
+                <w:sz w:val="22"/>
+                <w:szCs w:val="22"/>
+                <w:lang w:val="uz-Cyrl-UZ"/>
+              </w:rPr>
               <w:t>{{qaynona}}</w:t>
             </w:r>
           </w:p>
@@ -3777,6 +4175,11 @@
               </w:rPr>
             </w:pPr>
             <w:r>
+              <w:rPr>
+                <w:sz w:val="22"/>
+                <w:szCs w:val="22"/>
+                <w:lang w:val="uz-Cyrl-UZ"/>
+              </w:rPr>
               <w:t>{{qaynona_yil}}</w:t>
             </w:r>
           </w:p>
@@ -3797,19 +4200,14 @@
               </w:rPr>
             </w:pPr>
             <w:r>
+              <w:rPr>
+                <w:sz w:val="22"/>
+                <w:szCs w:val="22"/>
+                <w:lang w:val="uz-Cyrl-UZ"/>
+              </w:rPr>
               <w:t>{{qaynona_ish}}</w:t>
             </w:r>
           </w:p>
-          <w:p>
-            <w:pPr>
-              <w:jc w:val="center"/>
-              <w:rPr>
-                <w:sz w:val="22"/>
-                <w:szCs w:val="22"/>
-                <w:lang w:val="uz-Cyrl-UZ"/>
-              </w:rPr>
-            </w:pPr>
-          </w:p>
         </w:tc>
         <w:tc>
           <w:tcPr>
@@ -3827,6 +4225,11 @@
               </w:rPr>
             </w:pPr>
             <w:r>
+              <w:rPr>
+                <w:sz w:val="22"/>
+                <w:szCs w:val="22"/>
+                <w:lang w:val="uz-Cyrl-UZ"/>
+              </w:rPr>
               <w:t>{{qaynona_tur}}</w:t>
             </w:r>
           </w:p>

</xml_diff>

<commit_message>
Unify Obyektivka preview, demo, and paid exports around master DOCX template.
Co-authored-by: Cursor <cursoragent@cursor.com>
</commit_message>
<xml_diff>
--- a/templates/obyektivka_master.docx
+++ b/templates/obyektivka_master.docx
@@ -29,6 +29,8 @@
           <w:lang w:val="uz-Cyrl-UZ"/>
           <w:sz w:val="28"/>
           <w:szCs w:val="28"/>
+          <w:b/>
+          <w:bCs/>
         </w:rPr>
         <w:t>МАЪЛУМОТНОМА</w:t>
       </w:r>
@@ -55,12 +57,12 @@
       <w:r>
         <w:rPr>
           <w:lang w:val="uz-Cyrl-UZ"/>
+          <w:u w:val="single"/>
+          <w:color w:val="000000"/>
+          <w:sz w:val="22"/>
+          <w:szCs w:val="22"/>
           <w:b w:val="0"/>
           <w:bCs w:val="0"/>
-          <w:u w:val="single"/>
-          <w:color w:val="000000"/>
-          <w:sz w:val="20"/>
-          <w:szCs w:val="20"/>
         </w:rPr>
         <w:pict>
           <v:rect id="_x0000_s1030" o:spid="_x0000_s1030" o:spt="1" style="position:absolute;left:0pt;margin-left:405pt;margin-top:1.9pt;height:113.4pt;width:85.05pt;z-index:251659264;mso-width-relative:page;mso-height-relative:page;" coordsize="21600,21600">
@@ -84,28 +86,32 @@
                   <w:r>
                     <w:rPr>
                       <w:lang w:val="uz-Latn-UZ"/>
+                      <w:u w:val="single"/>
+                      <w:color w:val="000000"/>
+                      <w:sz w:val="22"/>
+                      <w:szCs w:val="22"/>
                       <w:b w:val="0"/>
                       <w:bCs w:val="0"/>
-                      <w:u w:val="single"/>
-                      <w:color w:val="000000"/>
-                      <w:sz w:val="20"/>
-                      <w:szCs w:val="20"/>
                     </w:rPr>
                     <w:t>{{photo}}</w:t>
                   </w:r>
                   <w:r>
                     <w:rPr>
                       <w:lang w:val="uz-Latn-UZ"/>
-                      <w:sz w:val="20"/>
-                      <w:szCs w:val="20"/>
+                      <w:sz w:val="22"/>
+                      <w:szCs w:val="22"/>
+                      <w:b w:val="0"/>
+                      <w:bCs w:val="0"/>
                     </w:rPr>
                     <w:br w:type="textWrapping"/>
                   </w:r>
                   <w:r>
                     <w:rPr>
                       <w:lang w:val="uz-Cyrl-UZ"/>
-                      <w:sz w:val="20"/>
-                      <w:szCs w:val="20"/>
+                      <w:sz w:val="22"/>
+                      <w:szCs w:val="22"/>
+                      <w:b w:val="0"/>
+                      <w:bCs w:val="0"/>
                     </w:rPr>
                     <w:t xml:space="preserve">3х4 см, </w:t>
                   </w:r>
@@ -113,8 +119,10 @@
                     <w:rPr>
                       <w:u w:val="single"/>
                       <w:lang w:val="uz-Cyrl-UZ"/>
-                      <w:sz w:val="20"/>
-                      <w:szCs w:val="20"/>
+                      <w:sz w:val="22"/>
+                      <w:szCs w:val="22"/>
+                      <w:b w:val="0"/>
+                      <w:bCs w:val="0"/>
                     </w:rPr>
                     <w:t xml:space="preserve">охирги </w:t>
                   </w:r>
@@ -122,8 +130,10 @@
                     <w:rPr>
                       <w:u w:val="single"/>
                       <w:lang w:val="uz-Latn-UZ"/>
-                      <w:sz w:val="20"/>
-                      <w:szCs w:val="20"/>
+                      <w:sz w:val="22"/>
+                      <w:szCs w:val="22"/>
+                      <w:b w:val="0"/>
+                      <w:bCs w:val="0"/>
                     </w:rPr>
                     <w:br w:type="textWrapping"/>
                   </w:r>
@@ -131,32 +141,40 @@
                     <w:rPr>
                       <w:u w:val="single"/>
                       <w:lang w:val="uz-Cyrl-UZ"/>
-                      <w:sz w:val="20"/>
-                      <w:szCs w:val="20"/>
+                      <w:sz w:val="22"/>
+                      <w:szCs w:val="22"/>
+                      <w:b w:val="0"/>
+                      <w:bCs w:val="0"/>
                     </w:rPr>
                     <w:t>3 ой давомида</w:t>
                   </w:r>
                   <w:r>
                     <w:rPr>
                       <w:lang w:val="uz-Cyrl-UZ"/>
-                      <w:sz w:val="20"/>
-                      <w:szCs w:val="20"/>
+                      <w:sz w:val="22"/>
+                      <w:szCs w:val="22"/>
+                      <w:b w:val="0"/>
+                      <w:bCs w:val="0"/>
                     </w:rPr>
                     <w:t xml:space="preserve"> олинган рангли фотосурат, электрон кўринишда </w:t>
                   </w:r>
                   <w:r>
                     <w:rPr>
                       <w:lang w:val="uz-Cyrl-UZ"/>
-                      <w:sz w:val="18"/>
-                      <w:szCs w:val="18"/>
+                      <w:sz w:val="22"/>
+                      <w:szCs w:val="22"/>
+                      <w:b w:val="0"/>
+                      <w:bCs w:val="0"/>
                     </w:rPr>
                     <w:t>(расмий кийимда).</w:t>
                   </w:r>
                   <w:r>
                     <w:rPr>
                       <w:lang w:val="uz-Cyrl-UZ"/>
-                      <w:sz w:val="20"/>
-                      <w:szCs w:val="20"/>
+                      <w:sz w:val="22"/>
+                      <w:szCs w:val="22"/>
+                      <w:b w:val="0"/>
+                      <w:bCs w:val="0"/>
                     </w:rPr>
                     <w:t xml:space="preserve">  </w:t>
                   </w:r>
@@ -188,7 +206,6 @@
       <w:r>
         <w:rPr>
           <w:lang w:val="uz-Cyrl-UZ"/>
-          <w:u w:val="single"/>
           <w:color w:val="000000"/>
           <w:sz w:val="28"/>
           <w:szCs w:val="28"/>
@@ -882,11 +899,13 @@
         <w:rPr>
           <w:sz w:val="22"/>
           <w:szCs w:val="22"/>
+          <w:highlight w:val="yellow"/>
           <w:lang w:val="uz-Cyrl-UZ"/>
         </w:rPr>
       </w:pPr>
       <w:r>
         <w:rPr>
+          <w:highlight w:val="yellow"/>
           <w:lang w:val="uz-Cyrl-UZ"/>
           <w:b/>
           <w:bCs/>
@@ -900,6 +919,7 @@
         <w:rPr>
           <w:b/>
           <w:bCs/>
+          <w:highlight w:val="yellow"/>
           <w:lang w:val="uz-Cyrl-UZ"/>
           <w:sz w:val="22"/>
           <w:szCs w:val="22"/>
@@ -910,6 +930,7 @@
         <w:rPr>
           <w:b/>
           <w:bCs/>
+          <w:highlight w:val="yellow"/>
           <w:lang w:val="uz-Cyrl-UZ"/>
           <w:sz w:val="22"/>
           <w:szCs w:val="22"/>
@@ -931,6 +952,7 @@
       </w:pPr>
       <w:r>
         <w:rPr>
+          <w:highlight w:val="yellow"/>
           <w:lang w:val="uz-Cyrl-UZ"/>
           <w:b w:val="0"/>
           <w:bCs w:val="0"/>
@@ -1291,22 +1313,21 @@
       <w:r>
         <w:rPr>
           <w:lang w:val="uz-Cyrl-UZ"/>
-          <w:sz w:val="24"/>
-          <w:szCs w:val="24"/>
-          <w:b/>
-          <w:bCs/>
+          <w:sz w:val="22"/>
+          <w:szCs w:val="22"/>
+          <w:b w:val="0"/>
+          <w:bCs w:val="0"/>
         </w:rPr>
         <w:br w:type="page"/>
       </w:r>
       <w:r>
         <w:rPr>
           <w:lang w:val="uz-Cyrl-UZ"/>
-          <w:u w:val="single"/>
           <w:color w:val="000000"/>
-          <w:sz w:val="24"/>
-          <w:szCs w:val="24"/>
-          <w:b/>
-          <w:bCs/>
+          <w:sz w:val="22"/>
+          <w:szCs w:val="22"/>
+          <w:b w:val="0"/>
+          <w:bCs w:val="0"/>
         </w:rPr>
         <w:t>{{fish}}нинг яқин қариндошлари ҳақида</w:t>
       </w:r>
@@ -1406,8 +1427,8 @@
                 <w:b/>
                 <w:bCs/>
                 <w:color w:val="000000"/>
-                <w:sz w:val="22"/>
-                <w:szCs w:val="22"/>
+                <w:sz w:val="24"/>
+                <w:szCs w:val="24"/>
               </w:rPr>
               <w:t>Қариндош</w:t>
             </w:r>
@@ -1417,8 +1438,8 @@
                 <w:b/>
                 <w:bCs/>
                 <w:color w:val="000000"/>
-                <w:sz w:val="22"/>
-                <w:szCs w:val="22"/>
+                <w:sz w:val="24"/>
+                <w:szCs w:val="24"/>
               </w:rPr>
               <w:t>-</w:t>
             </w:r>
@@ -1428,8 +1449,8 @@
                 <w:b/>
                 <w:bCs/>
                 <w:color w:val="000000"/>
-                <w:sz w:val="22"/>
-                <w:szCs w:val="22"/>
+                <w:sz w:val="24"/>
+                <w:szCs w:val="24"/>
               </w:rPr>
               <w:t>лиги</w:t>
             </w:r>
@@ -1457,8 +1478,8 @@
                 <w:b/>
                 <w:bCs/>
                 <w:color w:val="000000"/>
-                <w:sz w:val="22"/>
-                <w:szCs w:val="22"/>
+                <w:sz w:val="24"/>
+                <w:szCs w:val="24"/>
               </w:rPr>
               <w:t xml:space="preserve">Фамилияси, исми </w:t>
             </w:r>
@@ -1466,8 +1487,8 @@
               <w:rPr>
                 <w:b/>
                 <w:lang w:val="uz-Cyrl-UZ"/>
-                <w:sz w:val="22"/>
-                <w:szCs w:val="22"/>
+                <w:sz w:val="24"/>
+                <w:szCs w:val="24"/>
               </w:rPr>
               <w:br w:type="textWrapping"/>
             </w:r>
@@ -1477,8 +1498,8 @@
                 <w:b/>
                 <w:bCs/>
                 <w:color w:val="000000"/>
-                <w:sz w:val="22"/>
-                <w:szCs w:val="22"/>
+                <w:sz w:val="24"/>
+                <w:szCs w:val="24"/>
               </w:rPr>
               <w:t xml:space="preserve">ва отасининг исми </w:t>
             </w:r>
@@ -1503,40 +1524,68 @@
             <w:r>
               <w:rPr>
                 <w:lang w:val="uz-Cyrl-UZ"/>
-                <w:color w:val="000000"/>
-                <w:sz w:val="22"/>
-                <w:szCs w:val="22"/>
                 <w:b/>
                 <w:bCs/>
+                <w:color w:val="000000"/>
+                <w:sz w:val="24"/>
+                <w:szCs w:val="24"/>
               </w:rPr>
               <w:t xml:space="preserve">Туғилган йили </w:t>
             </w:r>
             <w:r>
               <w:rPr>
-                <w:lang w:val="uz-Cyrl-UZ"/>
-                <w:sz w:val="22"/>
-                <w:szCs w:val="22"/>
+                <w:b/>
+                <w:lang w:val="uz-Cyrl-UZ"/>
+                <w:sz w:val="24"/>
+                <w:szCs w:val="24"/>
+              </w:rPr>
+              <w:br w:type="textWrapping"/>
+            </w:r>
+            <w:r>
+              <w:rPr>
+                <w:lang w:val="uz-Cyrl-UZ"/>
                 <w:b/>
                 <w:bCs/>
-              </w:rPr>
-              <w:br w:type="textWrapping"/>
-            </w:r>
-            <w:r>
-              <w:rPr>
-                <w:lang w:val="uz-Cyrl-UZ"/>
-                <w:color w:val="000000"/>
-                <w:sz w:val="22"/>
-                <w:szCs w:val="22"/>
+                <w:color w:val="000000"/>
+                <w:sz w:val="24"/>
+                <w:szCs w:val="24"/>
+              </w:rPr>
+              <w:t>ва жойи</w:t>
+            </w:r>
+          </w:p>
+        </w:tc>
+        <w:tc>
+          <w:tcPr>
+            <w:tcW w:w="3027" w:type="dxa"/>
+            <w:noWrap w:val="0"/>
+            <w:vAlign w:val="center"/>
+          </w:tcPr>
+          <w:p>
+            <w:pPr>
+              <w:jc w:val="center"/>
+              <w:rPr>
+                <w:b/>
+                <w:sz w:val="22"/>
+                <w:szCs w:val="22"/>
+                <w:lang w:val="uz-Cyrl-UZ"/>
+              </w:rPr>
+            </w:pPr>
+            <w:r>
+              <w:rPr>
+                <w:lang w:val="uz-Cyrl-UZ"/>
                 <w:b/>
                 <w:bCs/>
-              </w:rPr>
-              <w:t>ва жойи</w:t>
-            </w:r>
-          </w:p>
-        </w:tc>
-        <w:tc>
-          <w:tcPr>
-            <w:tcW w:w="3027" w:type="dxa"/>
+                <w:color w:val="000000"/>
+                <w:sz w:val="24"/>
+                <w:szCs w:val="24"/>
+              </w:rPr>
+              <w:t>Иш жойи ва лавозими</w:t>
+            </w:r>
+          </w:p>
+        </w:tc>
+        <w:tc>
+          <w:tcPr>
+            <w:tcW w:w="2057" w:type="dxa"/>
             <w:noWrap w:val="0"/>
             <w:vAlign w:val="center"/>
           </w:tcPr>
@@ -1553,40 +1602,11 @@
             <w:r>
               <w:rPr>
                 <w:lang w:val="uz-Cyrl-UZ"/>
-                <w:color w:val="000000"/>
-                <w:sz w:val="22"/>
-                <w:szCs w:val="22"/>
                 <w:b/>
                 <w:bCs/>
-              </w:rPr>
-              <w:t>Иш жойи ва лавозими</w:t>
-            </w:r>
-          </w:p>
-        </w:tc>
-        <w:tc>
-          <w:tcPr>
-            <w:tcW w:w="2057" w:type="dxa"/>
-            <w:noWrap w:val="0"/>
-            <w:vAlign w:val="center"/>
-          </w:tcPr>
-          <w:p>
-            <w:pPr>
-              <w:jc w:val="center"/>
-              <w:rPr>
-                <w:b/>
-                <w:sz w:val="22"/>
-                <w:szCs w:val="22"/>
-                <w:lang w:val="uz-Cyrl-UZ"/>
-              </w:rPr>
-            </w:pPr>
-            <w:r>
-              <w:rPr>
-                <w:lang w:val="uz-Cyrl-UZ"/>
-                <w:color w:val="000000"/>
-                <w:sz w:val="22"/>
-                <w:szCs w:val="22"/>
-                <w:b/>
-                <w:bCs/>
+                <w:color w:val="000000"/>
+                <w:sz w:val="24"/>
+                <w:szCs w:val="24"/>
               </w:rPr>
               <w:t>Турар жойи</w:t>
             </w:r>
@@ -1634,11 +1654,11 @@
             <w:r>
               <w:rPr>
                 <w:lang w:val="uz-Cyrl-UZ"/>
-                <w:color w:val="000000"/>
-                <w:sz w:val="22"/>
-                <w:szCs w:val="22"/>
                 <w:b/>
                 <w:bCs/>
+                <w:color w:val="000000"/>
+                <w:sz w:val="24"/>
+                <w:szCs w:val="24"/>
               </w:rPr>
               <w:t>Отаси</w:t>
             </w:r>
@@ -1662,12 +1682,12 @@
             <w:r>
               <w:rPr>
                 <w:lang w:val="uz-Cyrl-UZ"/>
-                <w:b w:val="0"/>
-                <w:bCs w:val="0"/>
-                <w:u w:val="single"/>
-                <w:color w:val="000000"/>
-                <w:sz w:val="22"/>
-                <w:szCs w:val="22"/>
+                <w:u w:val="single"/>
+                <w:color w:val="000000"/>
+                <w:sz w:val="24"/>
+                <w:szCs w:val="24"/>
+                <w:b w:val="0"/>
+                <w:bCs w:val="0"/>
               </w:rPr>
               <w:t>{{ota}}</w:t>
             </w:r>
@@ -1691,12 +1711,12 @@
             <w:r>
               <w:rPr>
                 <w:lang w:val="uz-Cyrl-UZ"/>
-                <w:b w:val="0"/>
-                <w:bCs w:val="0"/>
-                <w:u w:val="single"/>
-                <w:color w:val="000000"/>
-                <w:sz w:val="22"/>
-                <w:szCs w:val="22"/>
+                <w:u w:val="single"/>
+                <w:color w:val="000000"/>
+                <w:sz w:val="24"/>
+                <w:szCs w:val="24"/>
+                <w:b w:val="0"/>
+                <w:bCs w:val="0"/>
               </w:rPr>
               <w:t>{{ota_yil}}</w:t>
             </w:r>
@@ -1720,12 +1740,12 @@
             <w:r>
               <w:rPr>
                 <w:lang w:val="uz-Cyrl-UZ"/>
-                <w:b w:val="0"/>
-                <w:bCs w:val="0"/>
-                <w:u w:val="single"/>
-                <w:color w:val="000000"/>
-                <w:sz w:val="22"/>
-                <w:szCs w:val="22"/>
+                <w:u w:val="single"/>
+                <w:color w:val="000000"/>
+                <w:sz w:val="24"/>
+                <w:szCs w:val="24"/>
+                <w:b w:val="0"/>
+                <w:bCs w:val="0"/>
               </w:rPr>
               <w:t>{{ota_ish}}</w:t>
             </w:r>
@@ -1749,12 +1769,12 @@
             <w:r>
               <w:rPr>
                 <w:lang w:val="uz-Cyrl-UZ"/>
-                <w:b w:val="0"/>
-                <w:bCs w:val="0"/>
-                <w:u w:val="single"/>
-                <w:color w:val="000000"/>
-                <w:sz w:val="22"/>
-                <w:szCs w:val="22"/>
+                <w:u w:val="single"/>
+                <w:color w:val="000000"/>
+                <w:sz w:val="24"/>
+                <w:szCs w:val="24"/>
+                <w:b w:val="0"/>
+                <w:bCs w:val="0"/>
               </w:rPr>
               <w:t>{{ota_tur}}</w:t>
             </w:r>
@@ -1802,11 +1822,11 @@
             <w:r>
               <w:rPr>
                 <w:lang w:val="uz-Cyrl-UZ"/>
-                <w:color w:val="000000"/>
-                <w:sz w:val="22"/>
-                <w:szCs w:val="22"/>
                 <w:b/>
                 <w:bCs/>
+                <w:color w:val="000000"/>
+                <w:sz w:val="24"/>
+                <w:szCs w:val="24"/>
               </w:rPr>
               <w:t>Онаси</w:t>
             </w:r>
@@ -1830,12 +1850,12 @@
             <w:r>
               <w:rPr>
                 <w:lang w:val="uz-Cyrl-UZ"/>
-                <w:b w:val="0"/>
-                <w:bCs w:val="0"/>
-                <w:u w:val="single"/>
-                <w:color w:val="000000"/>
-                <w:sz w:val="22"/>
-                <w:szCs w:val="22"/>
+                <w:u w:val="single"/>
+                <w:color w:val="000000"/>
+                <w:sz w:val="24"/>
+                <w:szCs w:val="24"/>
+                <w:b w:val="0"/>
+                <w:bCs w:val="0"/>
               </w:rPr>
               <w:t>{{ona}}</w:t>
             </w:r>
@@ -1859,12 +1879,12 @@
             <w:r>
               <w:rPr>
                 <w:lang w:val="uz-Cyrl-UZ"/>
-                <w:b w:val="0"/>
-                <w:bCs w:val="0"/>
-                <w:u w:val="single"/>
-                <w:color w:val="000000"/>
-                <w:sz w:val="22"/>
-                <w:szCs w:val="22"/>
+                <w:u w:val="single"/>
+                <w:color w:val="000000"/>
+                <w:sz w:val="24"/>
+                <w:szCs w:val="24"/>
+                <w:b w:val="0"/>
+                <w:bCs w:val="0"/>
               </w:rPr>
               <w:t>{{ona_yil}}</w:t>
             </w:r>
@@ -1889,12 +1909,12 @@
             <w:r>
               <w:rPr>
                 <w:lang w:val="uz-Cyrl-UZ"/>
-                <w:b w:val="0"/>
-                <w:bCs w:val="0"/>
-                <w:u w:val="single"/>
-                <w:color w:val="000000"/>
-                <w:sz w:val="22"/>
-                <w:szCs w:val="22"/>
+                <w:u w:val="single"/>
+                <w:color w:val="000000"/>
+                <w:sz w:val="24"/>
+                <w:szCs w:val="24"/>
+                <w:b w:val="0"/>
+                <w:bCs w:val="0"/>
               </w:rPr>
               <w:t>{{ona_ish}}</w:t>
             </w:r>
@@ -1942,11 +1962,11 @@
             <w:r>
               <w:rPr>
                 <w:lang w:val="uz-Cyrl-UZ"/>
-                <w:color w:val="000000"/>
-                <w:sz w:val="22"/>
-                <w:szCs w:val="22"/>
                 <w:b/>
                 <w:bCs/>
+                <w:color w:val="000000"/>
+                <w:sz w:val="24"/>
+                <w:szCs w:val="24"/>
               </w:rPr>
               <w:t>Опаси</w:t>
             </w:r>
@@ -1970,12 +1990,12 @@
             <w:r>
               <w:rPr>
                 <w:lang w:val="uz-Cyrl-UZ"/>
-                <w:b w:val="0"/>
-                <w:bCs w:val="0"/>
-                <w:u w:val="single"/>
-                <w:color w:val="000000"/>
-                <w:sz w:val="22"/>
-                <w:szCs w:val="22"/>
+                <w:u w:val="single"/>
+                <w:color w:val="000000"/>
+                <w:sz w:val="24"/>
+                <w:szCs w:val="24"/>
+                <w:b w:val="0"/>
+                <w:bCs w:val="0"/>
               </w:rPr>
               <w:t>{{opa}}</w:t>
             </w:r>
@@ -1999,12 +2019,12 @@
             <w:r>
               <w:rPr>
                 <w:lang w:val="uz-Cyrl-UZ"/>
-                <w:b w:val="0"/>
-                <w:bCs w:val="0"/>
-                <w:u w:val="single"/>
-                <w:color w:val="000000"/>
-                <w:sz w:val="22"/>
-                <w:szCs w:val="22"/>
+                <w:u w:val="single"/>
+                <w:color w:val="000000"/>
+                <w:sz w:val="24"/>
+                <w:szCs w:val="24"/>
+                <w:b w:val="0"/>
+                <w:bCs w:val="0"/>
               </w:rPr>
               <w:t>{{opa_yil}}</w:t>
             </w:r>
@@ -2028,12 +2048,12 @@
             <w:r>
               <w:rPr>
                 <w:lang w:val="uz-Cyrl-UZ"/>
-                <w:b w:val="0"/>
-                <w:bCs w:val="0"/>
-                <w:u w:val="single"/>
-                <w:color w:val="000000"/>
-                <w:sz w:val="22"/>
-                <w:szCs w:val="22"/>
+                <w:u w:val="single"/>
+                <w:color w:val="000000"/>
+                <w:sz w:val="24"/>
+                <w:szCs w:val="24"/>
+                <w:b w:val="0"/>
+                <w:bCs w:val="0"/>
               </w:rPr>
               <w:t>{{opa_ish}}</w:t>
             </w:r>
@@ -2057,12 +2077,12 @@
             <w:r>
               <w:rPr>
                 <w:lang w:val="uz-Cyrl-UZ"/>
-                <w:b w:val="0"/>
-                <w:bCs w:val="0"/>
-                <w:u w:val="single"/>
-                <w:color w:val="000000"/>
-                <w:sz w:val="22"/>
-                <w:szCs w:val="22"/>
+                <w:u w:val="single"/>
+                <w:color w:val="000000"/>
+                <w:sz w:val="24"/>
+                <w:szCs w:val="24"/>
+                <w:b w:val="0"/>
+                <w:bCs w:val="0"/>
               </w:rPr>
               <w:t>{{opa_tur}}</w:t>
             </w:r>
@@ -2110,11 +2130,11 @@
             <w:r>
               <w:rPr>
                 <w:lang w:val="uz-Cyrl-UZ"/>
-                <w:color w:val="000000"/>
-                <w:sz w:val="22"/>
-                <w:szCs w:val="22"/>
                 <w:b/>
                 <w:bCs/>
+                <w:color w:val="000000"/>
+                <w:sz w:val="24"/>
+                <w:szCs w:val="24"/>
               </w:rPr>
               <w:t>Синглиси</w:t>
             </w:r>
@@ -2138,12 +2158,12 @@
             <w:r>
               <w:rPr>
                 <w:lang w:val="uz-Cyrl-UZ"/>
-                <w:b w:val="0"/>
-                <w:bCs w:val="0"/>
-                <w:u w:val="single"/>
-                <w:color w:val="000000"/>
-                <w:sz w:val="22"/>
-                <w:szCs w:val="22"/>
+                <w:u w:val="single"/>
+                <w:color w:val="000000"/>
+                <w:sz w:val="24"/>
+                <w:szCs w:val="24"/>
+                <w:b w:val="0"/>
+                <w:bCs w:val="0"/>
               </w:rPr>
               <w:t>{{singil}}</w:t>
             </w:r>
@@ -2167,12 +2187,12 @@
             <w:r>
               <w:rPr>
                 <w:lang w:val="uz-Cyrl-UZ"/>
-                <w:b w:val="0"/>
-                <w:bCs w:val="0"/>
-                <w:u w:val="single"/>
-                <w:color w:val="000000"/>
-                <w:sz w:val="22"/>
-                <w:szCs w:val="22"/>
+                <w:u w:val="single"/>
+                <w:color w:val="000000"/>
+                <w:sz w:val="24"/>
+                <w:szCs w:val="24"/>
+                <w:b w:val="0"/>
+                <w:bCs w:val="0"/>
               </w:rPr>
               <w:t>{{singil_yil}}</w:t>
             </w:r>
@@ -2196,12 +2216,12 @@
             <w:r>
               <w:rPr>
                 <w:lang w:val="uz-Cyrl-UZ"/>
-                <w:b w:val="0"/>
-                <w:bCs w:val="0"/>
-                <w:u w:val="single"/>
-                <w:color w:val="000000"/>
-                <w:sz w:val="22"/>
-                <w:szCs w:val="22"/>
+                <w:u w:val="single"/>
+                <w:color w:val="000000"/>
+                <w:sz w:val="24"/>
+                <w:szCs w:val="24"/>
+                <w:b w:val="0"/>
+                <w:bCs w:val="0"/>
               </w:rPr>
               <w:t>{{singil_ish}}</w:t>
             </w:r>
@@ -2225,12 +2245,12 @@
             <w:r>
               <w:rPr>
                 <w:lang w:val="uz-Cyrl-UZ"/>
-                <w:b w:val="0"/>
-                <w:bCs w:val="0"/>
-                <w:u w:val="single"/>
-                <w:color w:val="000000"/>
-                <w:sz w:val="22"/>
-                <w:szCs w:val="22"/>
+                <w:u w:val="single"/>
+                <w:color w:val="000000"/>
+                <w:sz w:val="24"/>
+                <w:szCs w:val="24"/>
+                <w:b w:val="0"/>
+                <w:bCs w:val="0"/>
               </w:rPr>
               <w:t>{{singil_tur}}</w:t>
             </w:r>
@@ -2278,11 +2298,11 @@
             <w:r>
               <w:rPr>
                 <w:lang w:val="uz-Cyrl-UZ"/>
-                <w:color w:val="000000"/>
-                <w:sz w:val="22"/>
-                <w:szCs w:val="22"/>
                 <w:b/>
                 <w:bCs/>
+                <w:color w:val="000000"/>
+                <w:sz w:val="24"/>
+                <w:szCs w:val="24"/>
               </w:rPr>
               <w:t>Укаси</w:t>
             </w:r>
@@ -2306,12 +2326,12 @@
             <w:r>
               <w:rPr>
                 <w:lang w:val="uz-Cyrl-UZ"/>
-                <w:b w:val="0"/>
-                <w:bCs w:val="0"/>
-                <w:u w:val="single"/>
-                <w:color w:val="000000"/>
-                <w:sz w:val="22"/>
-                <w:szCs w:val="22"/>
+                <w:u w:val="single"/>
+                <w:color w:val="000000"/>
+                <w:sz w:val="24"/>
+                <w:szCs w:val="24"/>
+                <w:b w:val="0"/>
+                <w:bCs w:val="0"/>
               </w:rPr>
               <w:t>{{uka}}</w:t>
             </w:r>
@@ -2335,12 +2355,12 @@
             <w:r>
               <w:rPr>
                 <w:lang w:val="uz-Cyrl-UZ"/>
-                <w:b w:val="0"/>
-                <w:bCs w:val="0"/>
-                <w:u w:val="single"/>
-                <w:color w:val="000000"/>
-                <w:sz w:val="22"/>
-                <w:szCs w:val="22"/>
+                <w:u w:val="single"/>
+                <w:color w:val="000000"/>
+                <w:sz w:val="24"/>
+                <w:szCs w:val="24"/>
+                <w:b w:val="0"/>
+                <w:bCs w:val="0"/>
               </w:rPr>
               <w:t>{{uka_yil}}</w:t>
             </w:r>
@@ -2364,12 +2384,12 @@
             <w:r>
               <w:rPr>
                 <w:lang w:val="uz-Cyrl-UZ"/>
-                <w:b w:val="0"/>
-                <w:bCs w:val="0"/>
-                <w:u w:val="single"/>
-                <w:color w:val="000000"/>
-                <w:sz w:val="22"/>
-                <w:szCs w:val="22"/>
+                <w:u w:val="single"/>
+                <w:color w:val="000000"/>
+                <w:sz w:val="24"/>
+                <w:szCs w:val="24"/>
+                <w:b w:val="0"/>
+                <w:bCs w:val="0"/>
               </w:rPr>
               <w:t>{{uka_ish}}</w:t>
             </w:r>
@@ -2393,12 +2413,12 @@
             <w:r>
               <w:rPr>
                 <w:lang w:val="uz-Cyrl-UZ"/>
-                <w:b w:val="0"/>
-                <w:bCs w:val="0"/>
-                <w:u w:val="single"/>
-                <w:color w:val="000000"/>
-                <w:sz w:val="22"/>
-                <w:szCs w:val="22"/>
+                <w:u w:val="single"/>
+                <w:color w:val="000000"/>
+                <w:sz w:val="24"/>
+                <w:szCs w:val="24"/>
+                <w:b w:val="0"/>
+                <w:bCs w:val="0"/>
               </w:rPr>
               <w:t>{{uka_tur}}</w:t>
             </w:r>
@@ -2446,11 +2466,11 @@
             <w:r>
               <w:rPr>
                 <w:lang w:val="uz-Cyrl-UZ"/>
-                <w:color w:val="000000"/>
-                <w:sz w:val="22"/>
-                <w:szCs w:val="22"/>
                 <w:b/>
                 <w:bCs/>
+                <w:color w:val="000000"/>
+                <w:sz w:val="24"/>
+                <w:szCs w:val="24"/>
               </w:rPr>
               <w:t>Укаси</w:t>
             </w:r>
@@ -2474,12 +2494,12 @@
             <w:r>
               <w:rPr>
                 <w:lang w:val="uz-Cyrl-UZ"/>
-                <w:b w:val="0"/>
-                <w:bCs w:val="0"/>
-                <w:u w:val="single"/>
-                <w:color w:val="000000"/>
-                <w:sz w:val="22"/>
-                <w:szCs w:val="22"/>
+                <w:u w:val="single"/>
+                <w:color w:val="000000"/>
+                <w:sz w:val="24"/>
+                <w:szCs w:val="24"/>
+                <w:b w:val="0"/>
+                <w:bCs w:val="0"/>
               </w:rPr>
               <w:t>{{aka}}</w:t>
             </w:r>
@@ -2503,12 +2523,12 @@
             <w:r>
               <w:rPr>
                 <w:lang w:val="uz-Cyrl-UZ"/>
-                <w:b w:val="0"/>
-                <w:bCs w:val="0"/>
-                <w:u w:val="single"/>
-                <w:color w:val="000000"/>
-                <w:sz w:val="22"/>
-                <w:szCs w:val="22"/>
+                <w:u w:val="single"/>
+                <w:color w:val="000000"/>
+                <w:sz w:val="24"/>
+                <w:szCs w:val="24"/>
+                <w:b w:val="0"/>
+                <w:bCs w:val="0"/>
               </w:rPr>
               <w:t>{{aka_yil}}</w:t>
             </w:r>
@@ -2532,12 +2552,12 @@
             <w:r>
               <w:rPr>
                 <w:lang w:val="uz-Cyrl-UZ"/>
-                <w:b w:val="0"/>
-                <w:bCs w:val="0"/>
-                <w:u w:val="single"/>
-                <w:color w:val="000000"/>
-                <w:sz w:val="22"/>
-                <w:szCs w:val="22"/>
+                <w:u w:val="single"/>
+                <w:color w:val="000000"/>
+                <w:sz w:val="24"/>
+                <w:szCs w:val="24"/>
+                <w:b w:val="0"/>
+                <w:bCs w:val="0"/>
               </w:rPr>
               <w:t>{{aka_ish}}</w:t>
             </w:r>
@@ -2561,12 +2581,12 @@
             <w:r>
               <w:rPr>
                 <w:lang w:val="uz-Cyrl-UZ"/>
-                <w:b w:val="0"/>
-                <w:bCs w:val="0"/>
-                <w:u w:val="single"/>
-                <w:color w:val="000000"/>
-                <w:sz w:val="22"/>
-                <w:szCs w:val="22"/>
+                <w:u w:val="single"/>
+                <w:color w:val="000000"/>
+                <w:sz w:val="24"/>
+                <w:szCs w:val="24"/>
+                <w:b w:val="0"/>
+                <w:bCs w:val="0"/>
               </w:rPr>
               <w:t>{{aka_tur}}</w:t>
             </w:r>
@@ -2614,11 +2634,11 @@
             <w:r>
               <w:rPr>
                 <w:lang w:val="uz-Cyrl-UZ"/>
-                <w:color w:val="000000"/>
-                <w:sz w:val="22"/>
-                <w:szCs w:val="22"/>
                 <w:b/>
                 <w:bCs/>
+                <w:color w:val="000000"/>
+                <w:sz w:val="24"/>
+                <w:szCs w:val="24"/>
               </w:rPr>
               <w:t>Турмуш ўртоғи</w:t>
             </w:r>
@@ -2642,12 +2662,12 @@
             <w:r>
               <w:rPr>
                 <w:lang w:val="uz-Cyrl-UZ"/>
-                <w:b w:val="0"/>
-                <w:bCs w:val="0"/>
-                <w:u w:val="single"/>
-                <w:color w:val="000000"/>
-                <w:sz w:val="22"/>
-                <w:szCs w:val="22"/>
+                <w:u w:val="single"/>
+                <w:color w:val="000000"/>
+                <w:sz w:val="24"/>
+                <w:szCs w:val="24"/>
+                <w:b w:val="0"/>
+                <w:bCs w:val="0"/>
               </w:rPr>
               <w:t>{{turmush_ortogi}}</w:t>
             </w:r>
@@ -2671,12 +2691,12 @@
             <w:r>
               <w:rPr>
                 <w:lang w:val="uz-Cyrl-UZ"/>
-                <w:b w:val="0"/>
-                <w:bCs w:val="0"/>
-                <w:u w:val="single"/>
-                <w:color w:val="000000"/>
-                <w:sz w:val="22"/>
-                <w:szCs w:val="22"/>
+                <w:u w:val="single"/>
+                <w:color w:val="000000"/>
+                <w:sz w:val="24"/>
+                <w:szCs w:val="24"/>
+                <w:b w:val="0"/>
+                <w:bCs w:val="0"/>
               </w:rPr>
               <w:t>{{turmush_ortogi_yil}}</w:t>
             </w:r>
@@ -2700,12 +2720,12 @@
             <w:r>
               <w:rPr>
                 <w:lang w:val="uz-Cyrl-UZ"/>
-                <w:b w:val="0"/>
-                <w:bCs w:val="0"/>
-                <w:u w:val="single"/>
-                <w:color w:val="000000"/>
-                <w:sz w:val="22"/>
-                <w:szCs w:val="22"/>
+                <w:u w:val="single"/>
+                <w:color w:val="000000"/>
+                <w:sz w:val="24"/>
+                <w:szCs w:val="24"/>
+                <w:b w:val="0"/>
+                <w:bCs w:val="0"/>
               </w:rPr>
               <w:t>{{turmush_ortogi_ish}}</w:t>
             </w:r>
@@ -2729,12 +2749,12 @@
             <w:r>
               <w:rPr>
                 <w:lang w:val="uz-Cyrl-UZ"/>
-                <w:b w:val="0"/>
-                <w:bCs w:val="0"/>
-                <w:u w:val="single"/>
-                <w:color w:val="000000"/>
-                <w:sz w:val="22"/>
-                <w:szCs w:val="22"/>
+                <w:u w:val="single"/>
+                <w:color w:val="000000"/>
+                <w:sz w:val="24"/>
+                <w:szCs w:val="24"/>
+                <w:b w:val="0"/>
+                <w:bCs w:val="0"/>
               </w:rPr>
               <w:t>{{turmush_ortogi_tur}}</w:t>
             </w:r>
@@ -2782,11 +2802,11 @@
             <w:r>
               <w:rPr>
                 <w:lang w:val="uz-Cyrl-UZ"/>
-                <w:color w:val="000000"/>
-                <w:sz w:val="22"/>
-                <w:szCs w:val="22"/>
                 <w:b/>
                 <w:bCs/>
+                <w:color w:val="000000"/>
+                <w:sz w:val="24"/>
+                <w:szCs w:val="24"/>
               </w:rPr>
               <w:t>Ўғли</w:t>
             </w:r>
@@ -2810,12 +2830,12 @@
             <w:r>
               <w:rPr>
                 <w:lang w:val="uz-Cyrl-UZ"/>
-                <w:b w:val="0"/>
-                <w:bCs w:val="0"/>
-                <w:u w:val="single"/>
-                <w:color w:val="000000"/>
-                <w:sz w:val="22"/>
-                <w:szCs w:val="22"/>
+                <w:u w:val="single"/>
+                <w:color w:val="000000"/>
+                <w:sz w:val="24"/>
+                <w:szCs w:val="24"/>
+                <w:b w:val="0"/>
+                <w:bCs w:val="0"/>
               </w:rPr>
               <w:t>{{farzandlar}}</w:t>
             </w:r>
@@ -2839,12 +2859,12 @@
             <w:r>
               <w:rPr>
                 <w:lang w:val="uz-Cyrl-UZ"/>
-                <w:b w:val="0"/>
-                <w:bCs w:val="0"/>
-                <w:u w:val="single"/>
-                <w:color w:val="000000"/>
-                <w:sz w:val="22"/>
-                <w:szCs w:val="22"/>
+                <w:u w:val="single"/>
+                <w:color w:val="000000"/>
+                <w:sz w:val="24"/>
+                <w:szCs w:val="24"/>
+                <w:b w:val="0"/>
+                <w:bCs w:val="0"/>
               </w:rPr>
               <w:t>{{farzandlar_yil}}</w:t>
             </w:r>
@@ -2868,12 +2888,12 @@
             <w:r>
               <w:rPr>
                 <w:lang w:val="uz-Cyrl-UZ"/>
-                <w:b w:val="0"/>
-                <w:bCs w:val="0"/>
-                <w:u w:val="single"/>
-                <w:color w:val="000000"/>
-                <w:sz w:val="22"/>
-                <w:szCs w:val="22"/>
+                <w:u w:val="single"/>
+                <w:color w:val="000000"/>
+                <w:sz w:val="24"/>
+                <w:szCs w:val="24"/>
+                <w:b w:val="0"/>
+                <w:bCs w:val="0"/>
               </w:rPr>
               <w:t>{{farzandlar_ish}}</w:t>
             </w:r>
@@ -2897,12 +2917,12 @@
             <w:r>
               <w:rPr>
                 <w:lang w:val="uz-Cyrl-UZ"/>
-                <w:b w:val="0"/>
-                <w:bCs w:val="0"/>
-                <w:u w:val="single"/>
-                <w:color w:val="000000"/>
-                <w:sz w:val="22"/>
-                <w:szCs w:val="22"/>
+                <w:u w:val="single"/>
+                <w:color w:val="000000"/>
+                <w:sz w:val="24"/>
+                <w:szCs w:val="24"/>
+                <w:b w:val="0"/>
+                <w:bCs w:val="0"/>
               </w:rPr>
               <w:t>{{farzandlar_tur}}</w:t>
             </w:r>
@@ -2950,11 +2970,11 @@
             <w:r>
               <w:rPr>
                 <w:lang w:val="uz-Cyrl-UZ"/>
-                <w:color w:val="000000"/>
-                <w:sz w:val="22"/>
-                <w:szCs w:val="22"/>
                 <w:b/>
                 <w:bCs/>
+                <w:color w:val="000000"/>
+                <w:sz w:val="24"/>
+                <w:szCs w:val="24"/>
               </w:rPr>
               <w:t>Қизи</w:t>
             </w:r>
@@ -2978,12 +2998,12 @@
             <w:r>
               <w:rPr>
                 <w:lang w:val="uz-Cyrl-UZ"/>
-                <w:b w:val="0"/>
-                <w:bCs w:val="0"/>
-                <w:u w:val="single"/>
-                <w:color w:val="000000"/>
-                <w:sz w:val="22"/>
-                <w:szCs w:val="22"/>
+                <w:u w:val="single"/>
+                <w:color w:val="000000"/>
+                <w:sz w:val="24"/>
+                <w:szCs w:val="24"/>
+                <w:b w:val="0"/>
+                <w:bCs w:val="0"/>
               </w:rPr>
               <w:t>{{farzandlar_2}}</w:t>
             </w:r>
@@ -3007,12 +3027,12 @@
             <w:r>
               <w:rPr>
                 <w:lang w:val="uz-Cyrl-UZ"/>
-                <w:b w:val="0"/>
-                <w:bCs w:val="0"/>
-                <w:u w:val="single"/>
-                <w:color w:val="000000"/>
-                <w:sz w:val="22"/>
-                <w:szCs w:val="22"/>
+                <w:u w:val="single"/>
+                <w:color w:val="000000"/>
+                <w:sz w:val="24"/>
+                <w:szCs w:val="24"/>
+                <w:b w:val="0"/>
+                <w:bCs w:val="0"/>
               </w:rPr>
               <w:t>{{farzandlar_2_yil}}</w:t>
             </w:r>
@@ -3036,12 +3056,12 @@
             <w:r>
               <w:rPr>
                 <w:lang w:val="uz-Cyrl-UZ"/>
-                <w:b w:val="0"/>
-                <w:bCs w:val="0"/>
-                <w:u w:val="single"/>
-                <w:color w:val="000000"/>
-                <w:sz w:val="22"/>
-                <w:szCs w:val="22"/>
+                <w:u w:val="single"/>
+                <w:color w:val="000000"/>
+                <w:sz w:val="24"/>
+                <w:szCs w:val="24"/>
+                <w:b w:val="0"/>
+                <w:bCs w:val="0"/>
               </w:rPr>
               <w:t>{{farzandlar_2_ish}}</w:t>
             </w:r>
@@ -3065,12 +3085,12 @@
             <w:r>
               <w:rPr>
                 <w:lang w:val="uz-Cyrl-UZ"/>
-                <w:b w:val="0"/>
-                <w:bCs w:val="0"/>
-                <w:u w:val="single"/>
-                <w:color w:val="000000"/>
-                <w:sz w:val="22"/>
-                <w:szCs w:val="22"/>
+                <w:u w:val="single"/>
+                <w:color w:val="000000"/>
+                <w:sz w:val="24"/>
+                <w:szCs w:val="24"/>
+                <w:b w:val="0"/>
+                <w:bCs w:val="0"/>
               </w:rPr>
               <w:t>{{farzandlar_2_tur}}</w:t>
             </w:r>
@@ -3119,11 +3139,11 @@
             <w:r>
               <w:rPr>
                 <w:lang w:val="uz-Cyrl-UZ"/>
-                <w:color w:val="000000"/>
-                <w:sz w:val="22"/>
-                <w:szCs w:val="22"/>
                 <w:b/>
                 <w:bCs/>
+                <w:color w:val="000000"/>
+                <w:sz w:val="24"/>
+                <w:szCs w:val="24"/>
               </w:rPr>
               <w:t>Ўғли</w:t>
             </w:r>
@@ -3147,12 +3167,12 @@
             <w:r>
               <w:rPr>
                 <w:lang w:val="uz-Cyrl-UZ"/>
-                <w:b w:val="0"/>
-                <w:bCs w:val="0"/>
-                <w:u w:val="single"/>
-                <w:color w:val="000000"/>
-                <w:sz w:val="22"/>
-                <w:szCs w:val="22"/>
+                <w:u w:val="single"/>
+                <w:color w:val="000000"/>
+                <w:sz w:val="24"/>
+                <w:szCs w:val="24"/>
+                <w:b w:val="0"/>
+                <w:bCs w:val="0"/>
               </w:rPr>
               <w:t>{{farzandlar_3}}</w:t>
             </w:r>
@@ -3176,12 +3196,12 @@
             <w:r>
               <w:rPr>
                 <w:lang w:val="uz-Cyrl-UZ"/>
-                <w:b w:val="0"/>
-                <w:bCs w:val="0"/>
-                <w:u w:val="single"/>
-                <w:color w:val="000000"/>
-                <w:sz w:val="22"/>
-                <w:szCs w:val="22"/>
+                <w:u w:val="single"/>
+                <w:color w:val="000000"/>
+                <w:sz w:val="24"/>
+                <w:szCs w:val="24"/>
+                <w:b w:val="0"/>
+                <w:bCs w:val="0"/>
               </w:rPr>
               <w:t>{{farzandlar_3_yil}}</w:t>
             </w:r>
@@ -3205,12 +3225,12 @@
             <w:r>
               <w:rPr>
                 <w:lang w:val="uz-Cyrl-UZ"/>
-                <w:b w:val="0"/>
-                <w:bCs w:val="0"/>
-                <w:u w:val="single"/>
-                <w:color w:val="000000"/>
-                <w:sz w:val="22"/>
-                <w:szCs w:val="22"/>
+                <w:u w:val="single"/>
+                <w:color w:val="000000"/>
+                <w:sz w:val="24"/>
+                <w:szCs w:val="24"/>
+                <w:b w:val="0"/>
+                <w:bCs w:val="0"/>
               </w:rPr>
               <w:t>{{farzandlar_3_ish}}</w:t>
             </w:r>
@@ -3234,12 +3254,12 @@
             <w:r>
               <w:rPr>
                 <w:lang w:val="uz-Cyrl-UZ"/>
-                <w:b w:val="0"/>
-                <w:bCs w:val="0"/>
-                <w:u w:val="single"/>
-                <w:color w:val="000000"/>
-                <w:sz w:val="22"/>
-                <w:szCs w:val="22"/>
+                <w:u w:val="single"/>
+                <w:color w:val="000000"/>
+                <w:sz w:val="24"/>
+                <w:szCs w:val="24"/>
+                <w:b w:val="0"/>
+                <w:bCs w:val="0"/>
               </w:rPr>
               <w:t>{{farzandlar_3_tur}}</w:t>
             </w:r>
@@ -3287,11 +3307,11 @@
             <w:r>
               <w:rPr>
                 <w:lang w:val="uz-Cyrl-UZ"/>
-                <w:color w:val="000000"/>
-                <w:sz w:val="22"/>
-                <w:szCs w:val="22"/>
                 <w:b/>
                 <w:bCs/>
+                <w:color w:val="000000"/>
+                <w:sz w:val="24"/>
+                <w:szCs w:val="24"/>
               </w:rPr>
               <w:t>Ўғли</w:t>
             </w:r>
@@ -3315,12 +3335,12 @@
             <w:r>
               <w:rPr>
                 <w:lang w:val="uz-Cyrl-UZ"/>
-                <w:b w:val="0"/>
-                <w:bCs w:val="0"/>
-                <w:u w:val="single"/>
-                <w:color w:val="000000"/>
-                <w:sz w:val="22"/>
-                <w:szCs w:val="22"/>
+                <w:u w:val="single"/>
+                <w:color w:val="000000"/>
+                <w:sz w:val="24"/>
+                <w:szCs w:val="24"/>
+                <w:b w:val="0"/>
+                <w:bCs w:val="0"/>
               </w:rPr>
               <w:t>{{farzandlar_4}}</w:t>
             </w:r>
@@ -3344,12 +3364,12 @@
             <w:r>
               <w:rPr>
                 <w:lang w:val="uz-Cyrl-UZ"/>
-                <w:b w:val="0"/>
-                <w:bCs w:val="0"/>
-                <w:u w:val="single"/>
-                <w:color w:val="000000"/>
-                <w:sz w:val="22"/>
-                <w:szCs w:val="22"/>
+                <w:u w:val="single"/>
+                <w:color w:val="000000"/>
+                <w:sz w:val="24"/>
+                <w:szCs w:val="24"/>
+                <w:b w:val="0"/>
+                <w:bCs w:val="0"/>
               </w:rPr>
               <w:t>{{farzandlar_4_yil}}</w:t>
             </w:r>
@@ -3373,12 +3393,12 @@
             <w:r>
               <w:rPr>
                 <w:lang w:val="uz-Cyrl-UZ"/>
-                <w:b w:val="0"/>
-                <w:bCs w:val="0"/>
-                <w:u w:val="single"/>
-                <w:color w:val="000000"/>
-                <w:sz w:val="22"/>
-                <w:szCs w:val="22"/>
+                <w:u w:val="single"/>
+                <w:color w:val="000000"/>
+                <w:sz w:val="24"/>
+                <w:szCs w:val="24"/>
+                <w:b w:val="0"/>
+                <w:bCs w:val="0"/>
               </w:rPr>
               <w:t>{{farzandlar_4_ish}}</w:t>
             </w:r>
@@ -3402,12 +3422,12 @@
             <w:r>
               <w:rPr>
                 <w:lang w:val="uz-Cyrl-UZ"/>
-                <w:b w:val="0"/>
-                <w:bCs w:val="0"/>
-                <w:u w:val="single"/>
-                <w:color w:val="000000"/>
-                <w:sz w:val="22"/>
-                <w:szCs w:val="22"/>
+                <w:u w:val="single"/>
+                <w:color w:val="000000"/>
+                <w:sz w:val="24"/>
+                <w:szCs w:val="24"/>
+                <w:b w:val="0"/>
+                <w:bCs w:val="0"/>
               </w:rPr>
               <w:t>{{farzandlar_4_tur}}</w:t>
             </w:r>
@@ -3455,11 +3475,11 @@
             <w:r>
               <w:rPr>
                 <w:lang w:val="uz-Cyrl-UZ"/>
-                <w:color w:val="000000"/>
-                <w:sz w:val="22"/>
-                <w:szCs w:val="22"/>
                 <w:b/>
                 <w:bCs/>
+                <w:color w:val="000000"/>
+                <w:sz w:val="24"/>
+                <w:szCs w:val="24"/>
               </w:rPr>
               <w:t>Қизи</w:t>
             </w:r>
@@ -3483,12 +3503,12 @@
             <w:r>
               <w:rPr>
                 <w:lang w:val="uz-Cyrl-UZ"/>
-                <w:b w:val="0"/>
-                <w:bCs w:val="0"/>
-                <w:u w:val="single"/>
-                <w:color w:val="000000"/>
-                <w:sz w:val="22"/>
-                <w:szCs w:val="22"/>
+                <w:u w:val="single"/>
+                <w:color w:val="000000"/>
+                <w:sz w:val="24"/>
+                <w:szCs w:val="24"/>
+                <w:b w:val="0"/>
+                <w:bCs w:val="0"/>
               </w:rPr>
               <w:t>{{farzandlar_5}}</w:t>
             </w:r>
@@ -3512,12 +3532,12 @@
             <w:r>
               <w:rPr>
                 <w:lang w:val="uz-Cyrl-UZ"/>
-                <w:b w:val="0"/>
-                <w:bCs w:val="0"/>
-                <w:u w:val="single"/>
-                <w:color w:val="000000"/>
-                <w:sz w:val="22"/>
-                <w:szCs w:val="22"/>
+                <w:u w:val="single"/>
+                <w:color w:val="000000"/>
+                <w:sz w:val="24"/>
+                <w:szCs w:val="24"/>
+                <w:b w:val="0"/>
+                <w:bCs w:val="0"/>
               </w:rPr>
               <w:t>{{farzandlar_5_yil}}</w:t>
             </w:r>
@@ -3541,12 +3561,12 @@
             <w:r>
               <w:rPr>
                 <w:lang w:val="uz-Cyrl-UZ"/>
-                <w:b w:val="0"/>
-                <w:bCs w:val="0"/>
-                <w:u w:val="single"/>
-                <w:color w:val="000000"/>
-                <w:sz w:val="22"/>
-                <w:szCs w:val="22"/>
+                <w:u w:val="single"/>
+                <w:color w:val="000000"/>
+                <w:sz w:val="24"/>
+                <w:szCs w:val="24"/>
+                <w:b w:val="0"/>
+                <w:bCs w:val="0"/>
               </w:rPr>
               <w:t>{{farzandlar_5_ish}}</w:t>
             </w:r>
@@ -3570,12 +3590,12 @@
             <w:r>
               <w:rPr>
                 <w:lang w:val="uz-Cyrl-UZ"/>
-                <w:b w:val="0"/>
-                <w:bCs w:val="0"/>
-                <w:u w:val="single"/>
-                <w:color w:val="000000"/>
-                <w:sz w:val="22"/>
-                <w:szCs w:val="22"/>
+                <w:u w:val="single"/>
+                <w:color w:val="000000"/>
+                <w:sz w:val="24"/>
+                <w:szCs w:val="24"/>
+                <w:b w:val="0"/>
+                <w:bCs w:val="0"/>
               </w:rPr>
               <w:t>{{farzandlar_5_tur}}</w:t>
             </w:r>
@@ -3624,11 +3644,11 @@
             <w:r>
               <w:rPr>
                 <w:lang w:val="uz-Cyrl-UZ"/>
-                <w:color w:val="000000"/>
-                <w:sz w:val="22"/>
-                <w:szCs w:val="22"/>
                 <w:b/>
                 <w:bCs/>
+                <w:color w:val="000000"/>
+                <w:sz w:val="24"/>
+                <w:szCs w:val="24"/>
               </w:rPr>
               <w:t>Ўғли</w:t>
             </w:r>
@@ -3652,12 +3672,12 @@
             <w:r>
               <w:rPr>
                 <w:lang w:val="uz-Cyrl-UZ"/>
-                <w:b w:val="0"/>
-                <w:bCs w:val="0"/>
-                <w:u w:val="single"/>
-                <w:color w:val="000000"/>
-                <w:sz w:val="22"/>
-                <w:szCs w:val="22"/>
+                <w:u w:val="single"/>
+                <w:color w:val="000000"/>
+                <w:sz w:val="24"/>
+                <w:szCs w:val="24"/>
+                <w:b w:val="0"/>
+                <w:bCs w:val="0"/>
               </w:rPr>
               <w:t>{{farzandlar_6}}</w:t>
             </w:r>
@@ -3681,12 +3701,12 @@
             <w:r>
               <w:rPr>
                 <w:lang w:val="uz-Cyrl-UZ"/>
-                <w:b w:val="0"/>
-                <w:bCs w:val="0"/>
-                <w:u w:val="single"/>
-                <w:color w:val="000000"/>
-                <w:sz w:val="22"/>
-                <w:szCs w:val="22"/>
+                <w:u w:val="single"/>
+                <w:color w:val="000000"/>
+                <w:sz w:val="24"/>
+                <w:szCs w:val="24"/>
+                <w:b w:val="0"/>
+                <w:bCs w:val="0"/>
               </w:rPr>
               <w:t>{{farzandlar_6_yil}}</w:t>
             </w:r>
@@ -3710,12 +3730,12 @@
             <w:r>
               <w:rPr>
                 <w:lang w:val="uz-Cyrl-UZ"/>
-                <w:b w:val="0"/>
-                <w:bCs w:val="0"/>
-                <w:u w:val="single"/>
-                <w:color w:val="000000"/>
-                <w:sz w:val="22"/>
-                <w:szCs w:val="22"/>
+                <w:u w:val="single"/>
+                <w:color w:val="000000"/>
+                <w:sz w:val="24"/>
+                <w:szCs w:val="24"/>
+                <w:b w:val="0"/>
+                <w:bCs w:val="0"/>
               </w:rPr>
               <w:t>{{farzandlar_6_ish}}</w:t>
             </w:r>
@@ -3739,12 +3759,12 @@
             <w:r>
               <w:rPr>
                 <w:lang w:val="uz-Cyrl-UZ"/>
-                <w:b w:val="0"/>
-                <w:bCs w:val="0"/>
-                <w:u w:val="single"/>
-                <w:color w:val="000000"/>
-                <w:sz w:val="22"/>
-                <w:szCs w:val="22"/>
+                <w:u w:val="single"/>
+                <w:color w:val="000000"/>
+                <w:sz w:val="24"/>
+                <w:szCs w:val="24"/>
+                <w:b w:val="0"/>
+                <w:bCs w:val="0"/>
               </w:rPr>
               <w:t>{{farzandlar_6_tur}}</w:t>
             </w:r>
@@ -3792,11 +3812,11 @@
             <w:r>
               <w:rPr>
                 <w:lang w:val="uz-Cyrl-UZ"/>
-                <w:color w:val="000000"/>
-                <w:sz w:val="22"/>
-                <w:szCs w:val="22"/>
                 <w:b/>
                 <w:bCs/>
+                <w:color w:val="000000"/>
+                <w:sz w:val="24"/>
+                <w:szCs w:val="24"/>
               </w:rPr>
               <w:t>Қайнотаси</w:t>
             </w:r>
@@ -3820,12 +3840,12 @@
             <w:r>
               <w:rPr>
                 <w:lang w:val="uz-Cyrl-UZ"/>
-                <w:b w:val="0"/>
-                <w:bCs w:val="0"/>
-                <w:u w:val="single"/>
-                <w:color w:val="000000"/>
-                <w:sz w:val="22"/>
-                <w:szCs w:val="22"/>
+                <w:u w:val="single"/>
+                <w:color w:val="000000"/>
+                <w:sz w:val="24"/>
+                <w:szCs w:val="24"/>
+                <w:b w:val="0"/>
+                <w:bCs w:val="0"/>
               </w:rPr>
               <w:t>{{qaynota}}</w:t>
             </w:r>
@@ -3849,12 +3869,12 @@
             <w:r>
               <w:rPr>
                 <w:lang w:val="uz-Cyrl-UZ"/>
-                <w:b w:val="0"/>
-                <w:bCs w:val="0"/>
-                <w:u w:val="single"/>
-                <w:color w:val="000000"/>
-                <w:sz w:val="22"/>
-                <w:szCs w:val="22"/>
+                <w:u w:val="single"/>
+                <w:color w:val="000000"/>
+                <w:sz w:val="24"/>
+                <w:szCs w:val="24"/>
+                <w:b w:val="0"/>
+                <w:bCs w:val="0"/>
               </w:rPr>
               <w:t>{{qaynota_yil}}</w:t>
             </w:r>
@@ -3879,12 +3899,12 @@
             <w:r>
               <w:rPr>
                 <w:lang w:val="uz-Cyrl-UZ"/>
-                <w:b w:val="0"/>
-                <w:bCs w:val="0"/>
-                <w:u w:val="single"/>
-                <w:color w:val="000000"/>
-                <w:sz w:val="22"/>
-                <w:szCs w:val="22"/>
+                <w:u w:val="single"/>
+                <w:color w:val="000000"/>
+                <w:sz w:val="24"/>
+                <w:szCs w:val="24"/>
+                <w:b w:val="0"/>
+                <w:bCs w:val="0"/>
               </w:rPr>
               <w:t>{{qaynota_ish}}</w:t>
             </w:r>
@@ -3932,11 +3952,11 @@
             <w:r>
               <w:rPr>
                 <w:lang w:val="uz-Cyrl-UZ"/>
-                <w:color w:val="000000"/>
-                <w:sz w:val="22"/>
-                <w:szCs w:val="22"/>
                 <w:b/>
                 <w:bCs/>
+                <w:color w:val="000000"/>
+                <w:sz w:val="24"/>
+                <w:szCs w:val="24"/>
               </w:rPr>
               <w:t>Қайнонаси</w:t>
             </w:r>
@@ -3960,12 +3980,12 @@
             <w:r>
               <w:rPr>
                 <w:lang w:val="uz-Cyrl-UZ"/>
-                <w:b w:val="0"/>
-                <w:bCs w:val="0"/>
-                <w:u w:val="single"/>
-                <w:color w:val="000000"/>
-                <w:sz w:val="22"/>
-                <w:szCs w:val="22"/>
+                <w:u w:val="single"/>
+                <w:color w:val="000000"/>
+                <w:sz w:val="24"/>
+                <w:szCs w:val="24"/>
+                <w:b w:val="0"/>
+                <w:bCs w:val="0"/>
               </w:rPr>
               <w:t>{{qaynona}}</w:t>
             </w:r>
@@ -3989,12 +4009,12 @@
             <w:r>
               <w:rPr>
                 <w:lang w:val="uz-Cyrl-UZ"/>
-                <w:b w:val="0"/>
-                <w:bCs w:val="0"/>
-                <w:u w:val="single"/>
-                <w:color w:val="000000"/>
-                <w:sz w:val="22"/>
-                <w:szCs w:val="22"/>
+                <w:u w:val="single"/>
+                <w:color w:val="000000"/>
+                <w:sz w:val="24"/>
+                <w:szCs w:val="24"/>
+                <w:b w:val="0"/>
+                <w:bCs w:val="0"/>
               </w:rPr>
               <w:t>{{qaynona_yil}}</w:t>
             </w:r>
@@ -4018,12 +4038,12 @@
             <w:r>
               <w:rPr>
                 <w:lang w:val="uz-Cyrl-UZ"/>
-                <w:b w:val="0"/>
-                <w:bCs w:val="0"/>
-                <w:u w:val="single"/>
-                <w:color w:val="000000"/>
-                <w:sz w:val="22"/>
-                <w:szCs w:val="22"/>
+                <w:u w:val="single"/>
+                <w:color w:val="000000"/>
+                <w:sz w:val="24"/>
+                <w:szCs w:val="24"/>
+                <w:b w:val="0"/>
+                <w:bCs w:val="0"/>
               </w:rPr>
               <w:t>{{qaynona_ish}}</w:t>
             </w:r>
@@ -4047,12 +4067,12 @@
             <w:r>
               <w:rPr>
                 <w:lang w:val="uz-Cyrl-UZ"/>
-                <w:b w:val="0"/>
-                <w:bCs w:val="0"/>
-                <w:u w:val="single"/>
-                <w:color w:val="000000"/>
-                <w:sz w:val="22"/>
-                <w:szCs w:val="22"/>
+                <w:u w:val="single"/>
+                <w:color w:val="000000"/>
+                <w:sz w:val="24"/>
+                <w:szCs w:val="24"/>
+                <w:b w:val="0"/>
+                <w:bCs w:val="0"/>
               </w:rPr>
               <w:t>{{qaynona_tur}}</w:t>
             </w:r>

</xml_diff>